<commit_message>
v1.2.0: conditional burden claim, prevalence caveat, Table 10 rows for univariate AUC and domain counts
</commit_message>
<xml_diff>
--- a/01_MANUSCRIPT/BITS_Draft_Phishing_URL_Leakage_v10_P1_candidate.docx
+++ b/01_MANUSCRIPT/BITS_Draft_Phishing_URL_Leakage_v10_P1_candidate.docx
@@ -5336,7 +5336,7 @@
           <w:rFonts w:ascii="Times New Roman" w:hAnsi="Times New Roman" w:eastAsia="Times New Roman"/>
           <w:sz w:val="19"/>
         </w:rPr>
-        <w:t>Pola yang tampak konsisten: penurunan jumlah fitur menaikkan FPR pada kelas benign lebih cepat daripada menurunkan recall pada kelas phishing. Dari A0 ke A2, recall turun 0,0076 poin sementara FPR naik sekitar delapan kali lipat (0,000111 menjadi 0,000902). Pada korpus dengan prevalensi phishing rendah, kenaikan FPR pada orde ini berdampak jauh lebih besar terhadap beban investigasi analis daripada penurunan recall pada orde yang sama. Perbandingan ini bersifat deskriptif dan tidak boleh dipakai untuk menyimpulkan bahwa fitur konten "lebih penting" daripada fitur URL: A0 dan A2 juga berbeda dalam sumber representasi (lihat Bagian 3.4).</w:t>
+        <w:t>Pola yang tampak konsisten: penurunan jumlah fitur menaikkan FPR pada kelas benign lebih cepat daripada menurunkan recall pada kelas phishing. Dari A0 ke A2, recall turun 0,0076 poin sementara FPR naik sekitar delapan kali lipat (0,000111 menjadi 0,000902). Pada korpus dengan prevalensi phishing rendah, kenaikan FPR pada orde ini dapat berdampak lebih besar terhadap beban investigasi analis daripada penurunan recall pada orde yang sama, tetapi besaran beban yang sebenarnya bergantung pada jumlah baris benign dan phishing, prevalensi, aturan tindak lanjut, dan biaya per investigasi, yang tidak dimodelkan di sini. Perbandingan ini bersifat deskriptif dan tidak boleh dipakai untuk menyimpulkan bahwa fitur konten "lebih penting" daripada fitur URL: A0 dan A2 juga berbeda dalam sumber representasi (lihat Bagian 3.4).</w:t>
       </w:r>
     </w:p>
     <w:p>
@@ -7437,7 +7437,7 @@
           <w:rFonts w:ascii="Times New Roman" w:hAnsi="Times New Roman" w:eastAsia="Times New Roman"/>
           <w:sz w:val="19"/>
         </w:rPr>
-        <w:t>Perubahan komposisi kelas juga menjelaskan mengapa angka agregat tidak dapat dipakai untuk menyimpulkan tren. Bulan dengan prevalensi 90 % menghasilkan precision sangat tinggi secara aritmetika, sedangkan bulan dengan prevalensi 13 % menghasilkan precision jauh lebih rendah pada model yang sama. Membandingkan F1 antarbulan tanpa memperhitungkan hal ini akan menghasilkan kesimpulan yang salah arah.</w:t>
+        <w:t>Perubahan komposisi kelas sebagian menjelaskan mengapa angka agregat tidak dapat dipakai untuk menyimpulkan tren, meskipun TPR dan FPR tidak dijamin konstan antarbulan sehingga prevalensi bukan satu-satunya faktor. Bulan dengan prevalensi 90 % menghasilkan precision sangat tinggi secara aritmetika, sedangkan bulan dengan prevalensi 13 % menghasilkan precision jauh lebih rendah pada model yang sama. Membandingkan F1 antarbulan tanpa memperhitungkan hal ini akan menghasilkan kesimpulan yang salah arah.</w:t>
       </w:r>
     </w:p>
     <w:p>
@@ -11515,6 +11515,112 @@
                 <w:sz w:val="14"/>
               </w:rPr>
               <w:t>category_error_table.csv</w:t>
+            </w:r>
+          </w:p>
+        </w:tc>
+      </w:tr>
+      <w:tr>
+        <w:tc>
+          <w:tcPr>
+            <w:tcW w:type="dxa" w:w="3118"/>
+          </w:tcPr>
+          <w:p>
+            <w:pPr>
+              <w:jc w:val="left"/>
+            </w:pPr>
+            <w:r>
+              <w:rPr>
+                <w:rFonts w:ascii="Times New Roman" w:hAnsi="Times New Roman"/>
+                <w:sz w:val="14"/>
+              </w:rPr>
+              <w:t>AUC tunggal tiga kolom A0 (URLSimilarityIndex; LineOfCode; NoOfExternalRef)</w:t>
+            </w:r>
+          </w:p>
+        </w:tc>
+        <w:tc>
+          <w:tcPr>
+            <w:tcW w:type="dxa" w:w="3118"/>
+          </w:tcPr>
+          <w:p>
+            <w:pPr>
+              <w:jc w:val="left"/>
+            </w:pPr>
+            <w:r>
+              <w:rPr>
+                <w:rFonts w:ascii="Times New Roman" w:hAnsi="Times New Roman"/>
+                <w:sz w:val="14"/>
+              </w:rPr>
+              <w:t>0,9961; 0,9903; 0,9880</w:t>
+            </w:r>
+          </w:p>
+        </w:tc>
+        <w:tc>
+          <w:tcPr>
+            <w:tcW w:type="dxa" w:w="3118"/>
+          </w:tcPr>
+          <w:p>
+            <w:pPr>
+              <w:jc w:val="left"/>
+            </w:pPr>
+            <w:r>
+              <w:rPr>
+                <w:rFonts w:ascii="Times New Roman" w:hAnsi="Times New Roman"/>
+                <w:sz w:val="14"/>
+              </w:rPr>
+              <w:t>phiusiil_leakage_audit.md</w:t>
+            </w:r>
+          </w:p>
+        </w:tc>
+      </w:tr>
+      <w:tr>
+        <w:tc>
+          <w:tcPr>
+            <w:tcW w:type="dxa" w:w="3118"/>
+          </w:tcPr>
+          <w:p>
+            <w:pPr>
+              <w:jc w:val="left"/>
+            </w:pPr>
+            <w:r>
+              <w:rPr>
+                <w:rFonts w:ascii="Times New Roman" w:hAnsi="Times New Roman"/>
+                <w:sz w:val="14"/>
+              </w:rPr>
+              <w:t>Registrable domain unik dan baris ber-alamat IP pada PhiUSIIL</w:t>
+            </w:r>
+          </w:p>
+        </w:tc>
+        <w:tc>
+          <w:tcPr>
+            <w:tcW w:type="dxa" w:w="3118"/>
+          </w:tcPr>
+          <w:p>
+            <w:pPr>
+              <w:jc w:val="left"/>
+            </w:pPr>
+            <w:r>
+              <w:rPr>
+                <w:rFonts w:ascii="Times New Roman" w:hAnsi="Times New Roman"/>
+                <w:sz w:val="14"/>
+              </w:rPr>
+              <w:t>175.509; 636</w:t>
+            </w:r>
+          </w:p>
+        </w:tc>
+        <w:tc>
+          <w:tcPr>
+            <w:tcW w:type="dxa" w:w="3118"/>
+          </w:tcPr>
+          <w:p>
+            <w:pPr>
+              <w:jc w:val="left"/>
+            </w:pPr>
+            <w:r>
+              <w:rPr>
+                <w:rFonts w:ascii="Times New Roman" w:hAnsi="Times New Roman"/>
+                <w:sz w:val="14"/>
+              </w:rPr>
+              <w:t>phiusiil_leakage_audit.md</w:t>
             </w:r>
           </w:p>
         </w:tc>

</xml_diff>

<commit_message>
v1.3.0: integrate Experiment 9 (reverse transfer PhreshPhish to PhiUSIIL)
</commit_message>
<xml_diff>
--- a/01_MANUSCRIPT/BITS_Draft_Phishing_URL_Leakage_v10_P1_candidate.docx
+++ b/01_MANUSCRIPT/BITS_Draft_Phishing_URL_Leakage_v10_P1_candidate.docx
@@ -218,7 +218,7 @@
           <w:rFonts w:ascii="Times New Roman" w:hAnsi="Times New Roman" w:eastAsia="Times New Roman"/>
           <w:sz w:val="19"/>
         </w:rPr>
-        <w:t xml:space="preserve"> pada kategori host platform dan FPR 21,8% pada URL benign ≤30 karakter; kategori tumpang tindih ini bersifat deskriptif dan ketidakpastian klaster platform tidak terverifikasi. Kontribusi artikel adalah perbandingan yang dapat diaudit atas saturasi benchmark, evaluasi temporal, transfer lintas-korpus satu arah, trade-off ambang, dan pola galat deskriptif; bukan model baru atau </w:t>
+        <w:t xml:space="preserve"> pada kategori host platform dan FPR 21,8% pada URL benign ≤30 karakter; kategori tumpang tindih ini bersifat deskriptif dan ketidakpastian klaster platform tidak terverifikasi. Kontribusi artikel adalah perbandingan yang dapat diaudit atas saturasi benchmark, evaluasi temporal, transfer lintas-korpus dua arah, trade-off ambang, dan pola galat deskriptif; bukan model baru atau </w:t>
       </w:r>
       <w:r>
         <w:rPr>
@@ -283,7 +283,7 @@
           <w:rFonts w:ascii="Times New Roman" w:hAnsi="Times New Roman" w:eastAsia="Times New Roman"/>
           <w:sz w:val="19"/>
         </w:rPr>
-        <w:t>We examine how phishing URL detection results vary across split unit, time, and corpus using two phishing-URL datasets. The study combines a label-recoverability audit, random and site-disjoint splits, grouped feature ablation, within-corpus temporal evaluation on PhreshPhish, frozen A2 zero-shot transfer, validation-only threshold selection, and descriptive error analysis. On PhiUSIIL, A0/LightGBM achieved site-disjoint F1 0.999623; two retained features each had single-feature AUC above 0.988, consistent with descriptive benchmark saturation but not identifying its cause. PhreshPhish temporal A2/LightGBM achieved mean F1 0.800461. A2/LightGBM trained only on PhiUSIIL achieved F1 0.599064, benign FPR 0.986478, ROC-AUC 0.382566, and MCC −0.146445 on 168,035 PhreshPhish URLs, compared with source-domain F1 0.995985. These results describe portability on the tested pair and do not identify a temporal cause. The temporal test partition had previously been inspected in exploratory work and was not a blind or prospective holdout. In a separate temporal refit, threshold 0.884705 selected to meet validation FPR ≤1% yielded test FPR 1.1352% and recall 0.5440, compared with 7.6497% and 0.7380 at threshold 0.5. Error analysis found 37.1% of all false negatives in the hosting-platform category and 21.8% FPR among benign URLs ≤30 characters; these overlapping categories are descriptive, and platform-cluster uncertainty was not verified. The contribution is an auditable comparison of benchmark saturation, temporal evaluation, one-direction cross-corpus transfer, threshold trade-offs, and descriptive error patterns, not a new model or state-of-the-art claim.</w:t>
+        <w:t>We examine how phishing URL detection results vary across split unit, time, and corpus using two phishing-URL datasets. The study combines a label-recoverability audit, random and site-disjoint splits, grouped feature ablation, within-corpus temporal evaluation on PhreshPhish, two-direction frozen A2 zero-shot transfer, validation-only threshold selection, and descriptive error analysis. On PhiUSIIL, A0/LightGBM achieved site-disjoint F1 0.999623; two retained features each had single-feature AUC above 0.988, consistent with descriptive benchmark saturation but not identifying its cause. PhreshPhish temporal A2/LightGBM achieved mean F1 0.800461. A2/LightGBM trained only on PhiUSIIL achieved F1 0.599064, benign FPR 0.986478, ROC-AUC 0.382566, and MCC −0.146445 on 168,035 PhreshPhish URLs, compared with source-domain F1 0.995985. These results describe portability on the tested pair and do not identify a temporal cause. The temporal test partition had previously been inspected in exploratory work and was not a blind or prospective holdout. In a separate temporal refit, threshold 0.884705 selected to meet validation FPR ≤1% yielded test FPR 1.1352% and recall 0.5440, compared with 7.6497% and 0.7380 at threshold 0.5. Error analysis found 37.1% of all false negatives in the hosting-platform category and 21.8% FPR among benign URLs ≤30 characters; these overlapping categories are descriptive, and platform-cluster uncertainty was not verified. The contribution is an auditable comparison of benchmark saturation, temporal evaluation, two-direction cross-corpus transfer, threshold trade-offs, and descriptive error patterns, not a new model or state-of-the-art claim.</w:t>
       </w:r>
     </w:p>
     <w:p>
@@ -1444,7 +1444,7 @@
           <w:rFonts w:ascii="Times New Roman" w:hAnsi="Times New Roman" w:eastAsia="Times New Roman"/>
           <w:sz w:val="19"/>
         </w:rPr>
-        <w:t xml:space="preserve">Literatur transfer pada domain ini lebih tipis daripada literatur klasifikasi. Studi lintas dataset menunjukkan bahwa keandalan fitur tidak otomatis berpindah antar korpus [9], dan evaluasi leave-one-family-out pada korpus yang sama menunjukkan transfer yang buruk ke keluarga serangan yang tidak terlihat [24]. Kedua hasil itu menunjukkan bahwa portabilitas perlu diuji secara eksplisit, bukan disimpulkan dari skor dalam-korpus. Uji transfer beku satu arah dengan ekstraktor, model, dan ambang yang tidak disesuaikan pada target dilaporkan secara terbatas pada pasangan korpus PhiUSIIL dan PhreshPhish. Kontribusi artikel ini pada sumbu tersebut adalah bukti empiris spesifik untuk pasangan korpus itu dengan ekstraktor, urutan fitur, model, dan ambang yang dibekukan, dibaca bersama evaluasi temporal dalam korpus dan trade-off ambang yang dipilih pada validasi; ini penyediaan bukti yang dapat diaudit, bukan pengajuan metode adaptasi baru.</w:t>
+        <w:t xml:space="preserve">Literatur transfer pada domain ini lebih tipis daripada literatur klasifikasi. Studi lintas dataset menunjukkan bahwa keandalan fitur tidak otomatis berpindah antar korpus [9], dan evaluasi leave-one-family-out pada korpus yang sama menunjukkan transfer yang buruk ke keluarga serangan yang tidak terlihat [24]. Kedua hasil itu menunjukkan bahwa portabilitas perlu diuji secara eksplisit, bukan disimpulkan dari skor dalam-korpus. Uji transfer beku dua arah pada pasangan korpus PhiUSIIL dan PhreshPhish, dengan ekstraktor, model, dan ambang yang tidak disesuaikan pada target, dilaporkan pada artikel ini. Kontribusi artikel ini pada sumbu tersebut adalah bukti empiris spesifik untuk pasangan korpus itu dengan ekstraktor, urutan fitur, model, dan ambang yang dibekukan, dibaca bersama evaluasi temporal dalam korpus dan trade-off ambang yang dipilih pada validasi; ini penyediaan bukti yang dapat diaudit, bukan pengajuan metode adaptasi baru.</w:t>
       </w:r>
     </w:p>
     <w:p>
@@ -1544,7 +1544,7 @@
           <w:rFonts w:ascii="Times New Roman" w:hAnsi="Times New Roman" w:eastAsia="Times New Roman"/>
           <w:sz w:val="19"/>
         </w:rPr>
-        <w:t xml:space="preserve"> model A2 yang dilatih hanya pada PhiUSIIL menuju kohort uji PhreshPhish tanpa retraining, kalibrasi, atau penyetelan ambang. RQ5 mengukur trade-off ambang yang dipilih hanya pada validasi serta konsentrasi galat pada kategori URL yang telah ditentukan.</w:t>
+        <w:t xml:space="preserve"> model A2 tanpa retraining, kalibrasi, atau penyetelan ambang pada dua arah: dilatih pada PhiUSIIL dan diuji pada PhreshPhish, serta dilatih pada PhreshPhish dan diuji pada PhiUSIIL. RQ5 mengukur trade-off ambang yang dipilih hanya pada validasi serta konsentrasi galat pada kategori URL yang telah ditentukan.</w:t>
       </w:r>
     </w:p>
     <w:p>
@@ -1675,7 +1675,7 @@
           <w:rFonts w:ascii="Times New Roman" w:hAnsi="Times New Roman" w:eastAsia="Times New Roman"/>
           <w:sz w:val="19"/>
         </w:rPr>
-        <w:t xml:space="preserve"> PhiUSIIL→PhreshPhish menggunakan ekstraktor, urutan fitur, model, dan ambang yang dibekukan; desain ini secara langsung menguji portabilitas lintas-korpus.</w:t>
+        <w:t xml:space="preserve"> dua arah, PhiUSIIL→PhreshPhish dan PhreshPhish→PhiUSIIL, menggunakan ekstraktor, urutan fitur, model, dan ambang yang dibekukan; desain ini secara langsung menguji portabilitas lintas-korpus.</w:t>
       </w:r>
     </w:p>
     <w:p>
@@ -7558,12 +7558,13 @@
           <w:rFonts w:ascii="Times New Roman" w:hAnsi="Times New Roman" w:eastAsia="Times New Roman"/>
           <w:sz w:val="19"/>
         </w:rPr>
-        <w:t>Eksperimen ini menguji klaim paling langsung dalam artikel: apakah representasi A2 yang sama dapat dipindahkan dari PhiUSIIL ke PhreshPhish tanpa adaptasi. Tabel 7 memperlihatkan hasil seed 42. Referensi dalam-domain PhiUSIIL tetap mendekati plafon untuk kedua model, tetapi perilaku berubah tajam pada target.</w:t>
+        <w:t>Eksperimen ini menguji klaim paling langsung dalam artikel: apakah representasi A2 yang sama dapat dipindahkan antarkorpus tanpa adaptasi; dua arah diuji, PhiUSIIL→PhreshPhish dan PhreshPhish→PhiUSIIL. Tabel 7 memperlihatkan hasil seed 42. Referensi dalam-domain PhiUSIIL tetap mendekati plafon untuk kedua model, tetapi perilaku berubah tajam pada target.</w:t>
       </w:r>
     </w:p>
     <w:p>
       <w:pPr>
         <w:keepNext/>
+        <w:keepLines/>
         <w:spacing w:after="60"/>
         <w:ind w:firstLine="0"/>
         <w:jc w:val="center"/>
@@ -7581,7 +7582,7 @@
           <w:rFonts w:ascii="Times New Roman" w:hAnsi="Times New Roman" w:eastAsia="Times New Roman"/>
           <w:sz w:val="17"/>
         </w:rPr>
-        <w:t xml:space="preserve"> Transfer A2 seed 42 dengan model dan ambang 0,5 yang dibekukan. Baris target tidak menggunakan fitting atau penyetelan pada PhreshPhish.</w:t>
+        <w:t xml:space="preserve"> Transfer A2 seed 42 dengan model dan ambang 0,5 yang dibekukan, dua arah. Baris target tidak menggunakan fitting, kalibrasi, atau penyetelan ambang pada korpus target. Baris transfer PhiUSIIL→PhreshPhish dievaluasi pada 168.035 baris uji temporal; baris transfer PhreshPhish→PhiUSIIL pada 235.370 baris PhiUSIIL, dan baris PhreshPhish dalam-sumber pada 168.060 baris blok uji sebelum penyaringan URL terlihat (eksperimen 9).</w:t>
       </w:r>
     </w:p>
     <w:tbl>
@@ -8188,7 +8189,7 @@
                 <w:rFonts w:ascii="Times New Roman" w:hAnsi="Times New Roman" w:eastAsia="Times New Roman"/>
                 <w:sz w:val="14"/>
               </w:rPr>
-              <w:t>XGBoost</w:t>
+              <w:t>LightGBM</w:t>
             </w:r>
           </w:p>
         </w:tc>
@@ -8208,7 +8209,7 @@
                 <w:rFonts w:ascii="Times New Roman" w:hAnsi="Times New Roman" w:eastAsia="Times New Roman"/>
                 <w:sz w:val="14"/>
               </w:rPr>
-              <w:t>PhiUSIIL dalam-domain</w:t>
+              <w:t>PhreshPhish→PhiUSIIL zero-shot</w:t>
             </w:r>
           </w:p>
         </w:tc>
@@ -8228,7 +8229,7 @@
                 <w:rFonts w:ascii="Times New Roman" w:hAnsi="Times New Roman" w:eastAsia="Times New Roman"/>
                 <w:sz w:val="14"/>
               </w:rPr>
-              <w:t>0,995659</w:t>
+              <w:t>0,549564</w:t>
             </w:r>
           </w:p>
         </w:tc>
@@ -8248,7 +8249,7 @@
                 <w:rFonts w:ascii="Times New Roman" w:hAnsi="Times New Roman" w:eastAsia="Times New Roman"/>
                 <w:sz w:val="14"/>
               </w:rPr>
-              <w:t>0,998749</w:t>
+              <w:t>0,409503</w:t>
             </w:r>
           </w:p>
         </w:tc>
@@ -8268,7 +8269,7 @@
                 <w:rFonts w:ascii="Times New Roman" w:hAnsi="Times New Roman" w:eastAsia="Times New Roman"/>
                 <w:sz w:val="14"/>
               </w:rPr>
-              <w:t>0,992589</w:t>
+              <w:t>0,835237</w:t>
             </w:r>
           </w:p>
         </w:tc>
@@ -8288,7 +8289,7 @@
                 <w:rFonts w:ascii="Times New Roman" w:hAnsi="Times New Roman" w:eastAsia="Times New Roman"/>
                 <w:sz w:val="14"/>
               </w:rPr>
-              <w:t>0,000927</w:t>
+              <w:t>0,897783</w:t>
             </w:r>
           </w:p>
         </w:tc>
@@ -8308,7 +8309,7 @@
                 <w:rFonts w:ascii="Times New Roman" w:hAnsi="Times New Roman" w:eastAsia="Times New Roman"/>
                 <w:sz w:val="14"/>
               </w:rPr>
-              <w:t>0,998172</w:t>
+              <w:t>0,642939</w:t>
             </w:r>
           </w:p>
         </w:tc>
@@ -8328,7 +8329,7 @@
                 <w:rFonts w:ascii="Times New Roman" w:hAnsi="Times New Roman" w:eastAsia="Times New Roman"/>
                 <w:sz w:val="14"/>
               </w:rPr>
-              <w:t>0,998591</w:t>
+              <w:t>0,682202</w:t>
             </w:r>
           </w:p>
         </w:tc>
@@ -8348,7 +8349,7 @@
                 <w:rFonts w:ascii="Times New Roman" w:hAnsi="Times New Roman" w:eastAsia="Times New Roman"/>
                 <w:sz w:val="14"/>
               </w:rPr>
-              <w:t>0,992455</w:t>
+              <w:t>−0,092320</w:t>
             </w:r>
           </w:p>
         </w:tc>
@@ -8373,6 +8374,376 @@
                 <w:rFonts w:ascii="Times New Roman" w:hAnsi="Times New Roman" w:eastAsia="Times New Roman"/>
                 <w:sz w:val="14"/>
               </w:rPr>
+              <w:t>LightGBM</w:t>
+            </w:r>
+          </w:p>
+        </w:tc>
+        <w:tc>
+          <w:tcPr>
+            <w:tcW w:type="dxa" w:w="1039"/>
+            <w:vAlign w:val="center"/>
+          </w:tcPr>
+          <w:p>
+            <w:pPr>
+              <w:spacing w:after="0"/>
+              <w:ind w:firstLine="0"/>
+              <w:jc w:val="center"/>
+            </w:pPr>
+            <w:r>
+              <w:rPr>
+                <w:rFonts w:ascii="Times New Roman" w:hAnsi="Times New Roman" w:eastAsia="Times New Roman"/>
+                <w:sz w:val="14"/>
+              </w:rPr>
+              <w:t>PhreshPhish dalam-sumber</w:t>
+            </w:r>
+          </w:p>
+        </w:tc>
+        <w:tc>
+          <w:tcPr>
+            <w:tcW w:type="dxa" w:w="1039"/>
+            <w:vAlign w:val="center"/>
+          </w:tcPr>
+          <w:p>
+            <w:pPr>
+              <w:spacing w:after="0"/>
+              <w:ind w:firstLine="0"/>
+              <w:jc w:val="center"/>
+            </w:pPr>
+            <w:r>
+              <w:rPr>
+                <w:rFonts w:ascii="Times New Roman" w:hAnsi="Times New Roman" w:eastAsia="Times New Roman"/>
+                <w:sz w:val="14"/>
+              </w:rPr>
+              <w:t>0,805958</w:t>
+            </w:r>
+          </w:p>
+        </w:tc>
+        <w:tc>
+          <w:tcPr>
+            <w:tcW w:type="dxa" w:w="1039"/>
+            <w:vAlign w:val="center"/>
+          </w:tcPr>
+          <w:p>
+            <w:pPr>
+              <w:spacing w:after="0"/>
+              <w:ind w:firstLine="0"/>
+              <w:jc w:val="center"/>
+            </w:pPr>
+            <w:r>
+              <w:rPr>
+                <w:rFonts w:ascii="Times New Roman" w:hAnsi="Times New Roman" w:eastAsia="Times New Roman"/>
+                <w:sz w:val="14"/>
+              </w:rPr>
+              <w:t>0,889221</w:t>
+            </w:r>
+          </w:p>
+        </w:tc>
+        <w:tc>
+          <w:tcPr>
+            <w:tcW w:type="dxa" w:w="1039"/>
+            <w:vAlign w:val="center"/>
+          </w:tcPr>
+          <w:p>
+            <w:pPr>
+              <w:spacing w:after="0"/>
+              <w:ind w:firstLine="0"/>
+              <w:jc w:val="center"/>
+            </w:pPr>
+            <w:r>
+              <w:rPr>
+                <w:rFonts w:ascii="Times New Roman" w:hAnsi="Times New Roman" w:eastAsia="Times New Roman"/>
+                <w:sz w:val="14"/>
+              </w:rPr>
+              <w:t>0,736953</w:t>
+            </w:r>
+          </w:p>
+        </w:tc>
+        <w:tc>
+          <w:tcPr>
+            <w:tcW w:type="dxa" w:w="1039"/>
+            <w:vAlign w:val="center"/>
+          </w:tcPr>
+          <w:p>
+            <w:pPr>
+              <w:spacing w:after="0"/>
+              <w:ind w:firstLine="0"/>
+              <w:jc w:val="center"/>
+            </w:pPr>
+            <w:r>
+              <w:rPr>
+                <w:rFonts w:ascii="Times New Roman" w:hAnsi="Times New Roman" w:eastAsia="Times New Roman"/>
+                <w:sz w:val="14"/>
+              </w:rPr>
+              <w:t>0,077263</w:t>
+            </w:r>
+          </w:p>
+        </w:tc>
+        <w:tc>
+          <w:tcPr>
+            <w:tcW w:type="dxa" w:w="1039"/>
+            <w:vAlign w:val="center"/>
+          </w:tcPr>
+          <w:p>
+            <w:pPr>
+              <w:spacing w:after="0"/>
+              <w:ind w:firstLine="0"/>
+              <w:jc w:val="center"/>
+            </w:pPr>
+            <w:r>
+              <w:rPr>
+                <w:rFonts w:ascii="Times New Roman" w:hAnsi="Times New Roman" w:eastAsia="Times New Roman"/>
+                <w:sz w:val="14"/>
+              </w:rPr>
+              <w:t>0,909696</w:t>
+            </w:r>
+          </w:p>
+        </w:tc>
+        <w:tc>
+          <w:tcPr>
+            <w:tcW w:type="dxa" w:w="1039"/>
+            <w:vAlign w:val="center"/>
+          </w:tcPr>
+          <w:p>
+            <w:pPr>
+              <w:spacing w:after="0"/>
+              <w:ind w:firstLine="0"/>
+              <w:jc w:val="center"/>
+            </w:pPr>
+            <w:r>
+              <w:rPr>
+                <w:rFonts w:ascii="Times New Roman" w:hAnsi="Times New Roman" w:eastAsia="Times New Roman"/>
+                <w:sz w:val="14"/>
+              </w:rPr>
+              <w:t>0,913361</w:t>
+            </w:r>
+          </w:p>
+        </w:tc>
+        <w:tc>
+          <w:tcPr>
+            <w:tcW w:type="dxa" w:w="1039"/>
+            <w:vAlign w:val="center"/>
+          </w:tcPr>
+          <w:p>
+            <w:pPr>
+              <w:spacing w:after="0"/>
+              <w:ind w:firstLine="0"/>
+              <w:jc w:val="center"/>
+            </w:pPr>
+            <w:r>
+              <w:rPr>
+                <w:rFonts w:ascii="Times New Roman" w:hAnsi="Times New Roman" w:eastAsia="Times New Roman"/>
+                <w:sz w:val="14"/>
+              </w:rPr>
+              <w:t>0,677473</w:t>
+            </w:r>
+          </w:p>
+        </w:tc>
+      </w:tr>
+      <w:tr>
+        <w:trPr>
+          <w:cantSplit/>
+        </w:trPr>
+        <w:tc>
+          <w:tcPr>
+            <w:tcW w:type="dxa" w:w="1039"/>
+            <w:vAlign w:val="center"/>
+          </w:tcPr>
+          <w:p>
+            <w:pPr>
+              <w:spacing w:after="0"/>
+              <w:ind w:firstLine="0"/>
+              <w:jc w:val="left"/>
+            </w:pPr>
+            <w:r>
+              <w:rPr>
+                <w:rFonts w:ascii="Times New Roman" w:hAnsi="Times New Roman" w:eastAsia="Times New Roman"/>
+                <w:sz w:val="14"/>
+              </w:rPr>
+              <w:t>XGBoost</w:t>
+            </w:r>
+          </w:p>
+        </w:tc>
+        <w:tc>
+          <w:tcPr>
+            <w:tcW w:type="dxa" w:w="1039"/>
+            <w:vAlign w:val="center"/>
+          </w:tcPr>
+          <w:p>
+            <w:pPr>
+              <w:spacing w:after="0"/>
+              <w:ind w:firstLine="0"/>
+              <w:jc w:val="center"/>
+            </w:pPr>
+            <w:r>
+              <w:rPr>
+                <w:rFonts w:ascii="Times New Roman" w:hAnsi="Times New Roman" w:eastAsia="Times New Roman"/>
+                <w:sz w:val="14"/>
+              </w:rPr>
+              <w:t>PhiUSIIL dalam-domain</w:t>
+            </w:r>
+          </w:p>
+        </w:tc>
+        <w:tc>
+          <w:tcPr>
+            <w:tcW w:type="dxa" w:w="1039"/>
+            <w:vAlign w:val="center"/>
+          </w:tcPr>
+          <w:p>
+            <w:pPr>
+              <w:spacing w:after="0"/>
+              <w:ind w:firstLine="0"/>
+              <w:jc w:val="center"/>
+            </w:pPr>
+            <w:r>
+              <w:rPr>
+                <w:rFonts w:ascii="Times New Roman" w:hAnsi="Times New Roman" w:eastAsia="Times New Roman"/>
+                <w:sz w:val="14"/>
+              </w:rPr>
+              <w:t>0,995659</w:t>
+            </w:r>
+          </w:p>
+        </w:tc>
+        <w:tc>
+          <w:tcPr>
+            <w:tcW w:type="dxa" w:w="1039"/>
+            <w:vAlign w:val="center"/>
+          </w:tcPr>
+          <w:p>
+            <w:pPr>
+              <w:spacing w:after="0"/>
+              <w:ind w:firstLine="0"/>
+              <w:jc w:val="center"/>
+            </w:pPr>
+            <w:r>
+              <w:rPr>
+                <w:rFonts w:ascii="Times New Roman" w:hAnsi="Times New Roman" w:eastAsia="Times New Roman"/>
+                <w:sz w:val="14"/>
+              </w:rPr>
+              <w:t>0,998749</w:t>
+            </w:r>
+          </w:p>
+        </w:tc>
+        <w:tc>
+          <w:tcPr>
+            <w:tcW w:type="dxa" w:w="1039"/>
+            <w:vAlign w:val="center"/>
+          </w:tcPr>
+          <w:p>
+            <w:pPr>
+              <w:spacing w:after="0"/>
+              <w:ind w:firstLine="0"/>
+              <w:jc w:val="center"/>
+            </w:pPr>
+            <w:r>
+              <w:rPr>
+                <w:rFonts w:ascii="Times New Roman" w:hAnsi="Times New Roman" w:eastAsia="Times New Roman"/>
+                <w:sz w:val="14"/>
+              </w:rPr>
+              <w:t>0,992589</w:t>
+            </w:r>
+          </w:p>
+        </w:tc>
+        <w:tc>
+          <w:tcPr>
+            <w:tcW w:type="dxa" w:w="1039"/>
+            <w:vAlign w:val="center"/>
+          </w:tcPr>
+          <w:p>
+            <w:pPr>
+              <w:spacing w:after="0"/>
+              <w:ind w:firstLine="0"/>
+              <w:jc w:val="center"/>
+            </w:pPr>
+            <w:r>
+              <w:rPr>
+                <w:rFonts w:ascii="Times New Roman" w:hAnsi="Times New Roman" w:eastAsia="Times New Roman"/>
+                <w:sz w:val="14"/>
+              </w:rPr>
+              <w:t>0,000927</w:t>
+            </w:r>
+          </w:p>
+        </w:tc>
+        <w:tc>
+          <w:tcPr>
+            <w:tcW w:type="dxa" w:w="1039"/>
+            <w:vAlign w:val="center"/>
+          </w:tcPr>
+          <w:p>
+            <w:pPr>
+              <w:spacing w:after="0"/>
+              <w:ind w:firstLine="0"/>
+              <w:jc w:val="center"/>
+            </w:pPr>
+            <w:r>
+              <w:rPr>
+                <w:rFonts w:ascii="Times New Roman" w:hAnsi="Times New Roman" w:eastAsia="Times New Roman"/>
+                <w:sz w:val="14"/>
+              </w:rPr>
+              <w:t>0,998172</w:t>
+            </w:r>
+          </w:p>
+        </w:tc>
+        <w:tc>
+          <w:tcPr>
+            <w:tcW w:type="dxa" w:w="1039"/>
+            <w:vAlign w:val="center"/>
+          </w:tcPr>
+          <w:p>
+            <w:pPr>
+              <w:spacing w:after="0"/>
+              <w:ind w:firstLine="0"/>
+              <w:jc w:val="center"/>
+            </w:pPr>
+            <w:r>
+              <w:rPr>
+                <w:rFonts w:ascii="Times New Roman" w:hAnsi="Times New Roman" w:eastAsia="Times New Roman"/>
+                <w:sz w:val="14"/>
+              </w:rPr>
+              <w:t>0,998591</w:t>
+            </w:r>
+          </w:p>
+        </w:tc>
+        <w:tc>
+          <w:tcPr>
+            <w:tcW w:type="dxa" w:w="1039"/>
+            <w:vAlign w:val="center"/>
+          </w:tcPr>
+          <w:p>
+            <w:pPr>
+              <w:spacing w:after="0"/>
+              <w:ind w:firstLine="0"/>
+              <w:jc w:val="center"/>
+            </w:pPr>
+            <w:r>
+              <w:rPr>
+                <w:rFonts w:ascii="Times New Roman" w:hAnsi="Times New Roman" w:eastAsia="Times New Roman"/>
+                <w:sz w:val="14"/>
+              </w:rPr>
+              <w:t>0,992455</w:t>
+            </w:r>
+          </w:p>
+        </w:tc>
+      </w:tr>
+      <w:tr>
+        <w:trPr>
+          <w:cantSplit/>
+        </w:trPr>
+        <w:tc>
+          <w:tcPr>
+            <w:tcW w:type="dxa" w:w="1039"/>
+            <w:vAlign w:val="center"/>
+          </w:tcPr>
+          <w:p>
+            <w:pPr>
+              <w:spacing w:after="0"/>
+              <w:ind w:firstLine="0"/>
+              <w:jc w:val="left"/>
+            </w:pPr>
+            <w:r>
+              <w:rPr>
+                <w:rFonts w:ascii="Times New Roman" w:hAnsi="Times New Roman" w:eastAsia="Times New Roman"/>
+                <w:sz w:val="14"/>
+              </w:rPr>
               <w:t>XGBoost</w:t>
             </w:r>
           </w:p>
@@ -8586,6 +8957,20 @@
           <w:sz w:val="19"/>
         </w:rPr>
         <w:t xml:space="preserve"> transfer gagal. Perbedaan vendor, periode, prevalensi, dan distribusi URL hadir bersamaan; klaim yang sah terbatas pada kegagalan portabilitas PhiUSIIL→PhreshPhish pada konfigurasi yang diuji.</w:t>
+      </w:r>
+    </w:p>
+    <w:p>
+      <w:pPr>
+        <w:spacing w:after="60"/>
+        <w:ind w:firstLine="283"/>
+        <w:jc w:val="both"/>
+      </w:pPr>
+      <w:r>
+        <w:rPr>
+          <w:rFonts w:ascii="Times New Roman" w:hAnsi="Times New Roman" w:eastAsia="Times New Roman"/>
+          <w:sz w:val="19"/>
+        </w:rPr>
+        <w:t xml:space="preserve">Uji arah sebaliknya dijalankan dengan protokol yang sama pada eksperimen 9. Model dilatih hanya pada blok fit PhreshPhish (372.380 baris, 2 Juli 2024 sampai 30 Juni 2025), dibekukan, lalu diterapkan pada 235.370 baris PhiUSIIL hasil pembersihan tanpa fitting, kalibrasi, atau penyetelan ambang. Hasilnya juga gagal, tetapi dengan mekanisme yang berbeda: F1 0,549564, FPR benign 0,897783, MCC −0,092320, dan ROC-AUC 0,642939. Berbeda dari arah maju yang ROC-AUC-nya di bawah 0,5, di sini urutan skor masih sedikit informatif tetapi kalibrasinya tidak sesuai, sehingga pada ambang beku 0,5 sebanyak 89,8 % URL benign PhiUSIIL ditandai phishing. Sebagai pembanding, pengklasifikasi yang selalu memprediksi phishing pada korpus ini memperoleh F1 0,598529, sehingga F1 transfer terbalik berada di bawah baseline trivial tersebut. Tumpang tindih URL persis antara blok latih dan target hanya 137 baris (0,058 %), sedangkan tumpang tindih registrable domain mencapai 21,6 % baris target; angka terakhir membatasi interpretasi dan tidak menyelamatkan kinerja. Eksperimen ini bukan evaluasi temporal karena PhiUSIIL tidak memiliki penanda waktu, dan hasilnya tidak menetapkan penyebab kegagalan transfer.</w:t>
       </w:r>
     </w:p>
     <w:p>
@@ -11737,7 +12122,7 @@
           <w:rFonts w:ascii="Times New Roman" w:hAnsi="Times New Roman" w:eastAsia="Times New Roman"/>
           <w:sz w:val="19"/>
         </w:rPr>
-        <w:t>Keterbatasan penelitian membatasi generalisasi secara tegas. Pertama, hanya dua korpus, dua keluarga gradient boosting, satu arah transfer, dan satu snapshot target yang diuji; hasil tidak mewakili seluruh feed phishing atau periode lain. Kedua, transfer langsung mengontrol representasi dan adaptasi target, tetapi tidak memisahkan penyebab pergeseran karena vendor, waktu, populasi, dan prevalensi berubah bersama. Ketiga, fold sumber transfer berasal dari pembagian acak PhiUSIIL; F1 sumber karena itu bukan estimasi portabilitas ke domain baru. Keempat, ambang dipilih pada satu periode validasi PhreshPhish dan hanya diuji pada satu periode berikutnya; pencapaian batas FPR validasi tidak menjamin batas yang sama pada deployment. Kelima, taksonomi memakai kategori yang ditentukan manual, kedalaman subdomain perkiraan tanpa snapshot PSL privat, dan interval Wilson per baris yang tidak menangkap klaster domain; analisis tersebut eksploratif karena kohort uji telah diperiksa. Keenam, variasi seed tidak menggantikan variasi korpus atau periode, dan XGBoost deterministik pada konfigurasi tertentu. Ketujuh, penelitian tidak membandingkan ulang seluruh metode SOTA dalam pipeline yang sama, sehingga tidak mendukung klaim peringkat performa.</w:t>
+        <w:t>Keterbatasan penelitian membatasi generalisasi secara tegas. Pertama, hanya dua korpus, dua keluarga gradient boosting, dua arah transfer (PhiUSIIL→PhreshPhish dan PhreshPhish→PhiUSIIL), dan satu snapshot target yang diuji; hasil tidak mewakili seluruh feed phishing atau periode lain. Kedua, transfer langsung mengontrol representasi dan adaptasi target, tetapi tidak memisahkan penyebab pergeseran karena vendor, waktu, populasi, dan prevalensi berubah bersama. Ketiga, fold sumber transfer berasal dari pembagian acak PhiUSIIL; F1 sumber karena itu bukan estimasi portabilitas ke domain baru. Keempat, ambang dipilih pada satu periode validasi PhreshPhish dan hanya diuji pada satu periode berikutnya; pencapaian batas FPR validasi tidak menjamin batas yang sama pada deployment. Kelima, taksonomi memakai kategori yang ditentukan manual, kedalaman subdomain perkiraan tanpa snapshot PSL privat, dan interval Wilson per baris yang tidak menangkap klaster domain; analisis tersebut eksploratif karena kohort uji telah diperiksa. Keenam, variasi seed tidak menggantikan variasi korpus atau periode, dan XGBoost deterministik pada konfigurasi tertentu. Ketujuh, penelitian tidak membandingkan ulang seluruh metode SOTA dalam pipeline yang sama, sehingga tidak mendukung klaim peringkat performa.</w:t>
       </w:r>
     </w:p>
     <w:p>

</xml_diff>

<commit_message>
v1.4.0: re-review fixes (Table 10 sources, E9 interpretation, split manifests, Exp7 source)
</commit_message>
<xml_diff>
--- a/01_MANUSCRIPT/BITS_Draft_Phishing_URL_Leakage_v10_P1_candidate.docx
+++ b/01_MANUSCRIPT/BITS_Draft_Phishing_URL_Leakage_v10_P1_candidate.docx
@@ -1444,7 +1444,7 @@
           <w:rFonts w:ascii="Times New Roman" w:hAnsi="Times New Roman" w:eastAsia="Times New Roman"/>
           <w:sz w:val="19"/>
         </w:rPr>
-        <w:t xml:space="preserve">Literatur transfer pada domain ini lebih tipis daripada literatur klasifikasi. Studi lintas dataset menunjukkan bahwa keandalan fitur tidak otomatis berpindah antar korpus [9], dan evaluasi leave-one-family-out pada korpus yang sama menunjukkan transfer yang buruk ke keluarga serangan yang tidak terlihat [24]. Kedua hasil itu menunjukkan bahwa portabilitas perlu diuji secara eksplisit, bukan disimpulkan dari skor dalam-korpus. Uji transfer beku dua arah pada pasangan korpus PhiUSIIL dan PhreshPhish, dengan ekstraktor, model, dan ambang yang tidak disesuaikan pada target, dilaporkan pada artikel ini. Kontribusi artikel ini pada sumbu tersebut adalah bukti empiris spesifik untuk pasangan korpus itu dengan ekstraktor, urutan fitur, model, dan ambang yang dibekukan, dibaca bersama evaluasi temporal dalam korpus dan trade-off ambang yang dipilih pada validasi; ini penyediaan bukti yang dapat diaudit, bukan pengajuan metode adaptasi baru.</w:t>
+        <w:t xml:space="preserve">Literatur transfer lintas korpus pada domain ini lebih sedikit dijumpai dibanding literatur klasifikasi dalam-korpus pada penelusuran terarah yang dilakukan di sini; pernyataan ini tidak didasarkan pada survei kuantitatif. Studi lintas dataset menunjukkan bahwa keandalan fitur tidak otomatis berpindah antar korpus [9], dan evaluasi leave-one-family-out pada korpus yang sama menunjukkan transfer yang buruk ke keluarga serangan yang tidak terlihat [24]. Kedua hasil itu menunjukkan bahwa portabilitas perlu diuji secara eksplisit, bukan disimpulkan dari skor dalam-korpus. Uji transfer beku dua arah pada pasangan korpus PhiUSIIL dan PhreshPhish, dengan ekstraktor, model, dan ambang yang tidak disesuaikan pada target, dilaporkan pada artikel ini. Kontribusi artikel ini pada sumbu tersebut adalah bukti empiris spesifik untuk pasangan korpus itu dengan ekstraktor, urutan fitur, model, dan ambang yang dibekukan, dibaca bersama evaluasi temporal dalam korpus dan trade-off ambang yang dipilih pada validasi; ini penyediaan bukti yang dapat diaudit, bukan pengajuan metode adaptasi baru.</w:t>
       </w:r>
     </w:p>
     <w:p>
@@ -1759,14 +1759,7 @@
           <w:rFonts w:ascii="Times New Roman" w:hAnsi="Times New Roman" w:eastAsia="Times New Roman"/>
           <w:sz w:val="19"/>
         </w:rPr>
-        <w:t>Penelitian ini menggunakan pendekatan eksperimen kuantitatif dengan empat tahap: (1) pengumpulan dan pembersihan data; (2) konstruksi protokol evaluasi dengan pemisahan registrable domain; (3) pelatihan dan evaluasi model; (4) analisis kesenjangan akurasi–deployment. Seluruh artefak eksperimen bersifat deterministik terhadap seed yang dicatat, dan setiap angka yang dilaporkan pada Bagian 3 berasal dari berkas hasil yang tersimpan, bukan dari pengukuran ulang secara manual.</w:t>
-      </w:r>
-      <w:r>
-        <w:rPr>
-          <w:rFonts w:ascii="Times New Roman" w:hAnsi="Times New Roman" w:eastAsia="Times New Roman"/>
-          <w:sz w:val="19"/>
-        </w:rPr>
-        <w:t xml:space="preserve"> Pernyataan determinisme penuh tidak diverifikasi melalui artefak; yang dicatat adalah konfigurasi dan seed untuk replikasi.</w:t>
+        <w:t>Penelitian ini menggunakan pendekatan eksperimen kuantitatif dengan empat tahap: (1) pengumpulan dan pembersihan data; (2) konstruksi protokol evaluasi dengan pemisahan registrable domain; (3) pelatihan dan evaluasi model; (4) analisis kesenjangan akurasi–deployment. Seluruh artefak eksperimen mencatat konfigurasi dan seed untuk replikasi, dan setiap angka yang dilaporkan pada Bagian 3 berasal dari berkas hasil yang tersimpan, bukan dari pengukuran ulang secara manual.</w:t>
       </w:r>
     </w:p>
     <w:p>
@@ -1780,7 +1773,7 @@
           <w:rFonts w:ascii="Times New Roman" w:hAnsi="Times New Roman" w:eastAsia="Times New Roman"/>
           <w:sz w:val="19"/>
         </w:rPr>
-        <w:t>Jumlah kecocokan model utama yang dilaporkan adalah 85 kecocokan terpilih: 60 kecocokan benchmark PhiUSIIL, 10 kecocokan evaluasi temporal PhreshPhish, 10 kecocokan transfer lintas-korpus (2 model × 5 seed), dan 5 kecocokan LightGBM untuk evaluasi ambang operasional. Angka 85 adalah cakupan kecocokan yang dipilih untuk dilaporkan, bukan seluruh kecocokan yang pernah dieksekusi: arm temporal 10 kecocokan dilaporkan sekali, sedangkan rerun paritas 10 kecocokan yang identik secara metrik tidak dihitung. Empat run diagnostik 10 kecocokan non-final dengan metrik berbeda, uji paritas pra-penerbangan, uji waktu tunggal, dan dua pemeriksaan asap non-final yang tidak menyelesaikan matriks penuh juga tidak dihitung. Pipeline evaluasi versi awal tidak menyumbang kecocokan pada angka ini: keluarannya hanya metrik agregat tanpa prediksi per baris, dan cabang temporalnya berhenti sebagai stub/uji kering tanpa pemberian skor. Taksonomi galat tidak melatih model baru.</w:t>
+        <w:t>Jumlah kecocokan model utama yang dilaporkan adalah 90 kecocokan terpilih: 60 kecocokan benchmark PhiUSIIL, 10 kecocokan evaluasi temporal PhreshPhish, 10 kecocokan transfer lintas-korpus arah maju (2 model × 5 seed), 5 kecocokan LightGBM untuk evaluasi ambang operasional, dan 5 kecocokan LightGBM untuk transfer arah balik pada eksperimen 9. Angka 90 adalah cakupan kecocokan yang dipilih untuk dilaporkan, bukan seluruh kecocokan yang pernah dieksekusi: arm temporal 10 kecocokan dilaporkan sekali, sedangkan rerun paritas 10 kecocokan yang identik secara metrik tidak dihitung. Empat run diagnostik 10 kecocokan non-final dengan metrik berbeda, uji paritas pra-penerbangan, uji waktu tunggal, dan dua pemeriksaan asap non-final yang tidak menyelesaikan matriks penuh juga tidak dihitung. Pipeline evaluasi versi awal tidak menyumbang kecocokan pada angka ini: keluarannya hanya metrik agregat tanpa prediksi per baris, dan cabang temporalnya berhenti sebagai stub/uji kering tanpa pemberian skor. Taksonomi galat tidak melatih model baru.</w:t>
       </w:r>
     </w:p>
     <w:p>
@@ -1873,7 +1866,7 @@
           <w:rFonts w:ascii="Times New Roman" w:hAnsi="Times New Roman" w:eastAsia="Times New Roman"/>
           <w:sz w:val="19"/>
         </w:rPr>
-        <w:t xml:space="preserve"> Pipeline audit generalisasi. Eksperimen transfer membekukan ekstraktor A2, urutan 18 fitur, model, dan ambang 0,5 setelah pelatihan pada PhiUSIIL. PhreshPhish hanya digunakan sebagai target evaluasi; tidak ada retraining, kalibrasi, atau pemilihan ambang berbasis target. Jalur temporal dan ambang PhreshPhish merupakan eksperimen terpisah dan tidak digunakan untuk mengadaptasi model transfer.</w:t>
+        <w:t xml:space="preserve"> Pipeline audit generalisasi. Jalur yang digambarkan adalah arm transfer arah maju: ekstraktor A2, urutan 18 fitur, model, dan ambang 0,5 dibekukan setelah pelatihan pada PhiUSIIL, dan PhreshPhish hanya digunakan sebagai target evaluasi tanpa retraining, kalibrasi, atau pemilihan ambang berbasis target. Arm arah balik (PhreshPhish→PhiUSIIL) dijalankan pada eksperimen 9 dan tidak digambarkan di sini. Jalur temporal dan ambang PhreshPhish merupakan eksperimen terpisah dan tidak digunakan untuk mengadaptasi model transfer.</w:t>
       </w:r>
     </w:p>
     <w:p>
@@ -1993,7 +1986,7 @@
           <w:rFonts w:ascii="Times New Roman" w:hAnsi="Times New Roman" w:eastAsia="Times New Roman"/>
           <w:sz w:val="19"/>
         </w:rPr>
-        <w:t xml:space="preserve"> Nilai AUC ditampilkan hingga empat desimal; pernyataan "di atas 0,988" karena itu mengacu pada nilai tak-terbulatkan, bukan pada perbandingan nilai terbulatkan.</w:t>
+        <w:t xml:space="preserve"> Nilai AUC ditampilkan hingga empat desimal; pernyataan "di atas 0,988" karena itu dibaca sebagai sekitar 0,988 atau lebih, bukan sebagai perbandingan nilai terbulatkan.</w:t>
       </w:r>
     </w:p>
     <w:p>
@@ -7494,7 +7487,7 @@
           <w:rFonts w:ascii="Times New Roman" w:hAnsi="Times New Roman" w:eastAsia="Times New Roman"/>
           <w:sz w:val="19"/>
         </w:rPr>
-        <w:t>Lebih penting lagi, evaluasi temporal pada PhreshPhish tidak dapat dipisahkan dari dua sumber perancu. Pertama, faktor temporal: periode uji berasal dari waktu yang lebih akhir daripada periode latih. Kedua, faktor populasi dan vendor: korpus PhreshPhish dikumpulkan melalui pipeline dan vendor yang berbeda dari PhiUSIIL, sehingga perbedaan distribusi dapat berasal dari perbedaan sumber pengumpulan, bukan dari perubahan perilaku penyerang seiring waktu. Kedua sumber perancu ini bercampur dan tidak dapat dipisahkan dengan data yang tersedia. Klaim yang sah adalah "model A2 yang dilatih pada periode awal memperoleh F1 0,800 pada periode akhir korpus PhreshPhish", bukan "kinerja model menurun 20 poin karena waktu".</w:t>
+        <w:t>Lebih penting lagi, evaluasi temporal pada PhreshPhish tidak dapat dipisahkan dari dua sumber perancu. Pertama, faktor temporal: periode uji berasal dari waktu yang lebih akhir daripada periode latih. Kedua, faktor populasi dan vendor: korpus PhreshPhish dikumpulkan melalui pipeline dan vendor yang berbeda dari PhiUSIIL, sehingga perbedaan distribusi antara kedua korpus dapat berasal dari perbedaan sumber pengumpulan, bukan dari perubahan perilaku penyerang seiring waktu. Perancu vendor ini berlaku pada perbandingan lintas korpus PhiUSIIL–PhreshPhish, bukan pada perbandingan antarbulan di dalam PhreshPhish, karena seluruh blok temporal PhreshPhish berasal dari sumber pengumpulan yang sama. Kedua sumber perancu ini bercampur dan tidak dapat dipisahkan dengan data yang tersedia. Klaim yang sah adalah "model A2 yang dilatih pada periode awal memperoleh F1 0,800 pada periode akhir korpus PhreshPhish", bukan "kinerja model menurun 20 poin karena waktu".</w:t>
       </w:r>
       <w:r>
         <w:rPr>
@@ -7582,7 +7575,7 @@
           <w:rFonts w:ascii="Times New Roman" w:hAnsi="Times New Roman" w:eastAsia="Times New Roman"/>
           <w:sz w:val="17"/>
         </w:rPr>
-        <w:t xml:space="preserve"> Transfer A2 seed 42 dengan model dan ambang 0,5 yang dibekukan, dua arah. Baris target tidak menggunakan fitting, kalibrasi, atau penyetelan ambang pada korpus target. Baris transfer PhiUSIIL→PhreshPhish dievaluasi pada 168.035 baris uji temporal; baris transfer PhreshPhish→PhiUSIIL pada 235.370 baris PhiUSIIL, dan baris PhreshPhish dalam-sumber pada 168.060 baris blok uji sebelum penyaringan URL terlihat (eksperimen 9).</w:t>
+        <w:t xml:space="preserve"> Transfer A2 seed 42 dengan model dan ambang 0,5 yang dibekukan, dua arah. Baris target tidak menggunakan fitting, kalibrasi, atau penyetelan ambang pada korpus target. Baris PhiUSIIL→PhreshPhish dievaluasi pada 168.035 baris uji temporal setelah penyaringan kanonik yang mengeluarkan 3 URL terlihat di latih dan 22 duplikat URL. Baris PhreshPhish→PhiUSIIL dievaluasi pada 235.370 baris PhiUSIIL, dan baris PhreshPhish dalam-sumber pada 168.060 baris blok uji sebelum rangkaian penyaringan kanonik yang sama diterapkan (eksperimen 9). Arah balik hanya memakai LightGBM, dan deduplikasi pada eksperimen 9 memakai string URL persis di dalam blok tanggal, bukan kunci URL kanonik yang dipakai eksperimen temporal dan ambang.</w:t>
       </w:r>
     </w:p>
     <w:tbl>
@@ -8970,7 +8963,7 @@
           <w:rFonts w:ascii="Times New Roman" w:hAnsi="Times New Roman" w:eastAsia="Times New Roman"/>
           <w:sz w:val="19"/>
         </w:rPr>
-        <w:t xml:space="preserve">Uji arah sebaliknya dijalankan dengan protokol yang sama pada eksperimen 9. Model dilatih hanya pada blok fit PhreshPhish (372.380 baris, 2 Juli 2024 sampai 30 Juni 2025), dibekukan, lalu diterapkan pada 235.370 baris PhiUSIIL hasil pembersihan tanpa fitting, kalibrasi, atau penyetelan ambang. Hasilnya juga gagal, tetapi dengan mekanisme yang berbeda: F1 0,549564, FPR benign 0,897783, MCC −0,092320, dan ROC-AUC 0,642939. Berbeda dari arah maju yang ROC-AUC-nya di bawah 0,5, di sini urutan skor masih sedikit informatif tetapi kalibrasinya tidak sesuai, sehingga pada ambang beku 0,5 sebanyak 89,8 % URL benign PhiUSIIL ditandai phishing. Sebagai pembanding, pengklasifikasi yang selalu memprediksi phishing pada korpus ini memperoleh F1 0,598529, sehingga F1 transfer terbalik berada di bawah baseline trivial tersebut. Tumpang tindih URL persis antara blok latih dan target hanya 137 baris (0,058 %), sedangkan tumpang tindih registrable domain mencapai 21,6 % baris target; angka terakhir membatasi interpretasi dan tidak menyelamatkan kinerja. Eksperimen ini bukan evaluasi temporal karena PhiUSIIL tidak memiliki penanda waktu, dan hasilnya tidak menetapkan penyebab kegagalan transfer.</w:t>
+        <w:t xml:space="preserve">Uji arah sebaliknya dijalankan pada eksperimen 9 dengan prinsip yang sama: representasi A2, model yang dibekukan, dan ambang 0,5 tanpa penyesuaian pada target. Model dilatih hanya pada blok fit PhreshPhish (372.380 baris, 2 Juli 2024 sampai 30 Juni 2025), lalu diterapkan pada 235.370 baris PhiUSIIL hasil pembersihan. Kinerjanya juga buruk: F1 0,549564, FPR benign 0,897783, MCC −0,092320, dan ROC-AUC 0,642939. ROC-AUC di atas 0,5 menunjukkan pola pengurutan skor yang berbeda dari arah maju, sedangkan FPR 0,897783 menunjukkan ketidaksesuaian titik operasi pada kohort target: pada ambang beku 0,5, 89,8 % URL benign PhiUSIIL ditandai phishing. Sebagai pembanding titik, pengklasifikasi yang selalu memprediksi phishing pada korpus ini memperoleh F1 0,598529, sehingga F1 transfer terbalik pada ambang 0,5 berada di bawah baseline tersebut; perbandingan ini tidak berlaku untuk semua metrik atau semua ambang. Hasil ini tidak memisahkan kontribusi perubahan diskriminasi dari ketidaksesuaian kalibrasi, dan tidak menetapkan penyebab kegagalan transfer maupun menjamin bahwa kalibrasi ulang akan memulihkannya. Tumpang tindih URL persis antara blok latih dan target hanya 137 baris (0,058 %), sedangkan tumpang tindih registrable domain mencapai 21,6 % baris target; angka terakhir membatasi interpretasi dan tidak menyelamatkan kinerja. Interval bootstrap domain untuk arah balik tersedia pada artefak eksperimen 9 (F1 [0,512634; 0,586764], FPR [0,895279; 0,900180], MCC [−0,137850; −0,042795]; 1.000 replikasi, RNG seed 42, 175.509 domain). Eksperimen ini bukan evaluasi temporal karena PhiUSIIL tidak memiliki penanda waktu.</w:t>
       </w:r>
     </w:p>
     <w:p>
@@ -11193,7 +11186,7 @@
                 <w:rFonts w:ascii="Times New Roman" w:hAnsi="Times New Roman"/>
                 <w:sz w:val="14"/>
               </w:rPr>
-              <w:t>0,000163</w:t>
+              <w:t>0,000162</w:t>
             </w:r>
           </w:p>
         </w:tc>
@@ -11210,7 +11203,7 @@
                 <w:rFonts w:ascii="Times New Roman" w:hAnsi="Times New Roman"/>
                 <w:sz w:val="14"/>
               </w:rPr>
-              <w:t>results_random.csv; results_sitedisjoint.csv</w:t>
+              <w:t>summary.csv (eksperimen 5): 0,999811573 − 0,999649117</w:t>
             </w:r>
           </w:p>
         </w:tc>
@@ -11263,7 +11256,7 @@
                 <w:rFonts w:ascii="Times New Roman" w:hAnsi="Times New Roman"/>
                 <w:sz w:val="14"/>
               </w:rPr>
-              <w:t>results_random.csv; results_sitedisjoint.csv</w:t>
+              <w:t>summary.csv (eksperimen 5): 0,996364752 − 0,995186381</w:t>
             </w:r>
           </w:p>
         </w:tc>
@@ -11918,7 +11911,7 @@
                 <w:rFonts w:ascii="Times New Roman" w:hAnsi="Times New Roman"/>
                 <w:sz w:val="14"/>
               </w:rPr>
-              <w:t>AUC tunggal tiga kolom A0 (URLSimilarityIndex; LineOfCode; NoOfExternalRef)</w:t>
+              <w:t>AUC tunggal tiga kolom sumber: URLSimilarityIndex (dibuang); LineOfCode dan NoOfExternalRef (dipertahankan dalam A0)</w:t>
             </w:r>
           </w:p>
         </w:tc>
@@ -13484,7 +13477,7 @@
                 <w:rFonts w:ascii="Times New Roman" w:hAnsi="Times New Roman"/>
                 <w:sz w:val="14"/>
               </w:rPr>
-              <w:t>77 shard parquet (train-000... dan test-000...), 666.315 baris, 36,58 GB; SHA-256 per berkas tercatat pada input_manifest.json. Split resmi train/test dipakai apa adanya, bukan dibentuk ulang. Penanda tanggal diperlakukan sebagai tanggal pada berkas sumber.</w:t>
+              <w:t>77 shard parquet (train-000... dan test-000...), 666.315 baris, 36,58 GB; SHA-256 per berkas tercatat pada input_manifest.json. Keanggotaan split resmi train/test dipakai sebagai kerangka, bukan dibentuk ulang, tetapi blok temporal tetap melewati penyaringan: 681 baris latih pada atau setelah cutoff dikeluarkan sebelum blok fit dibentuk. Penanda tanggal diperlakukan sebagai tanggal pada berkas sumber.</w:t>
             </w:r>
           </w:p>
         </w:tc>
@@ -13556,7 +13549,7 @@
                 <w:rFonts w:ascii="Times New Roman" w:hAnsi="Times New Roman"/>
                 <w:sz w:val="14"/>
               </w:rPr>
-              <w:t>Nilai sumber berupa string benign/phish dan dipetakan ke 0/1; pipeline menolak nilai label di luar himpunan itu, sehingga tidak ada label di luar domain yang masuk.</w:t>
+              <w:t>Untuk PhreshPhish, nilai sumber berupa string benign/phish dan dipetakan ke 0/1; pipeline temporal dan ambang menolak nilai di luar himpunan itu. PhiUSIIL memakai pengodean numerik sumber 1 = legitim dan 0 = phishing, lalu dipetakan menjadi phishing = 1 pada analisis. Eksperimen 9 hanya membandingkan label PhreshPhish dengan string phish dan mencetak domain label, tanpa penolakan eksplisit; keluarannya hanya benign dan phish.</w:t>
             </w:r>
           </w:p>
         </w:tc>
@@ -13628,7 +13621,7 @@
                 <w:rFonts w:ascii="Times New Roman" w:hAnsi="Times New Roman"/>
                 <w:sz w:val="14"/>
               </w:rPr>
-              <w:t>src/features.py dengan SHA-256 c98b119c72c77df225bd21b7f803c367b71a934630622b3349ddecf349dc5864; dihitung deterministik per URL tanpa fitur halaman.</w:t>
+              <w:t>Dua salinan dipakai pada eksperimen berbeda. Eksperimen 7 memakai src/features.py dengan SHA-256 c98b119c72c77df225bd21b7f803c367b71a934630622b3349ddecf349dc5864; eksperimen 5 dan 9 memakai salinan dengan SHA-256 81822b4fac8b50cdf93371651e3c94680628ef189d64c32429ec15cc51cd48e6. Keduanya dihitung deterministik per URL tanpa fitur halaman. Kesetaraan nilai fitur antar kedua salinan tidak diperiksa pada artikel ini; yang dinyatakan adalah kontrak 18 fitur dan urutan yang sama.</w:t>
             </w:r>
           </w:p>
         </w:tc>
@@ -13844,7 +13837,7 @@
                 <w:rFonts w:ascii="Times New Roman" w:hAnsi="Times New Roman"/>
                 <w:sz w:val="14"/>
               </w:rPr>
-              <w:t>Spesifikasi perangkat keras dan jumlah thread tidak dicatat pada artefak; angka waktu adalah log eksekusi, bukan pembandingan biaya komputasi.</w:t>
+              <w:t>Metadata run mencatat 16 CPU logis, konfigurasi n_jobs = -1, dan identifikasi CPU generik; jumlah thread efektif, RAM, dan kondisi beban sistem tidak dicatat. Angka waktu karena itu adalah log eksekusi, bukan pembandingan biaya komputasi.</w:t>
             </w:r>
           </w:p>
         </w:tc>

</xml_diff>

<commit_message>
v1.5.0: 167-row reconciliation verified; per-experiment artefact map; estimand back-reference
</commit_message>
<xml_diff>
--- a/01_MANUSCRIPT/BITS_Draft_Phishing_URL_Leakage_v10_P1_candidate.docx
+++ b/01_MANUSCRIPT/BITS_Draft_Phishing_URL_Leakage_v10_P1_candidate.docx
@@ -3202,7 +3202,7 @@
           <w:rFonts w:ascii="Times New Roman" w:hAnsi="Times New Roman" w:eastAsia="Times New Roman"/>
           <w:sz w:val="19"/>
         </w:rPr>
-        <w:t xml:space="preserve"> Titik estimasi pada perbandingan itu adalah nilai model seed 42, bukan rerata lima seed pada Tabel 4, sehingga selisih pada Tabel 5 dan selisih rerata pada Tabel 4 memang berbeda dan tidak boleh dibandingkan langsung. Seed 42 di sini berperan sebagai seed model, sedangkan seed 42 pada bootstrap berperan sebagai seed RNG resampling; keduanya kebetulan bernilai sama tetapi berperan berbeda.</w:t>
+        <w:t xml:space="preserve"> Kembali ke perbandingan A1−A0: titik estimasinya adalah nilai model seed 42, bukan rerata lima seed pada Tabel 4; seed 42 di sini berperan sebagai seed model, sedangkan seed 42 pada bootstrap berperan sebagai seed RNG resampling. Karena itu selisih pada Tabel 5 dan selisih rerata pada Tabel 4 memang berbeda dan tidak boleh dibandingkan langsung. Untuk evaluasi temporal, interval dihitung dengan bootstrap pada unit registrable domain, 1.000 replikasi, dan seed RNG bootstrap 42, diterapkan pada prediksi model seed 13; angka 13 pada Tabel 6 menandai seed model, bukan seed RNG bootstrap.</w:t>
       </w:r>
     </w:p>
     <w:p>
@@ -8963,7 +8963,7 @@
           <w:rFonts w:ascii="Times New Roman" w:hAnsi="Times New Roman" w:eastAsia="Times New Roman"/>
           <w:sz w:val="19"/>
         </w:rPr>
-        <w:t xml:space="preserve">Uji arah sebaliknya dijalankan pada eksperimen 9 dengan prinsip yang sama: representasi A2, model yang dibekukan, dan ambang 0,5 tanpa penyesuaian pada target. Model dilatih hanya pada blok fit PhreshPhish (372.380 baris, 2 Juli 2024 sampai 30 Juni 2025), lalu diterapkan pada 235.370 baris PhiUSIIL hasil pembersihan. Kinerjanya juga buruk: F1 0,549564, FPR benign 0,897783, MCC −0,092320, dan ROC-AUC 0,642939. ROC-AUC di atas 0,5 menunjukkan pola pengurutan skor yang berbeda dari arah maju, sedangkan FPR 0,897783 menunjukkan ketidaksesuaian titik operasi pada kohort target: pada ambang beku 0,5, 89,8 % URL benign PhiUSIIL ditandai phishing. Sebagai pembanding titik, pengklasifikasi yang selalu memprediksi phishing pada korpus ini memperoleh F1 0,598529, sehingga F1 transfer terbalik pada ambang 0,5 berada di bawah baseline tersebut; perbandingan ini tidak berlaku untuk semua metrik atau semua ambang. Hasil ini tidak memisahkan kontribusi perubahan diskriminasi dari ketidaksesuaian kalibrasi, dan tidak menetapkan penyebab kegagalan transfer maupun menjamin bahwa kalibrasi ulang akan memulihkannya. Tumpang tindih URL persis antara blok latih dan target hanya 137 baris (0,058 %), sedangkan tumpang tindih registrable domain mencapai 21,6 % baris target; angka terakhir membatasi interpretasi dan tidak menyelamatkan kinerja. Interval bootstrap domain untuk arah balik tersedia pada artefak eksperimen 9 (F1 [0,512634; 0,586764], FPR [0,895279; 0,900180], MCC [−0,137850; −0,042795]; 1.000 replikasi, RNG seed 42, 175.509 domain). Eksperimen ini bukan evaluasi temporal karena PhiUSIIL tidak memiliki penanda waktu.</w:t>
+        <w:t xml:space="preserve">Uji arah sebaliknya dijalankan pada eksperimen 9 dengan prinsip yang sama: representasi A2, model yang dibekukan, dan ambang 0,5 tanpa penyesuaian pada target. Model dilatih hanya pada blok fit PhreshPhish (372.380 baris, 2 Juli 2024 sampai 30 Juni 2025), lalu diterapkan pada 235.370 baris PhiUSIIL hasil pembersihan. Kinerjanya juga buruk: F1 0,549564, FPR benign 0,897783, MCC −0,092320, dan ROC-AUC 0,642939. ROC-AUC di atas 0,5 menunjukkan pola pengurutan skor yang berbeda dari arah maju, sedangkan FPR 0,897783 menunjukkan ketidaksesuaian titik operasi pada kohort target: pada ambang beku 0,5, 89,8 % URL benign PhiUSIIL ditandai phishing. Sebagai pembanding titik, pengklasifikasi yang selalu memprediksi phishing pada korpus ini memperoleh F1 0,598529, sehingga F1 transfer terbalik pada ambang 0,5 berada di bawah baseline tersebut; perbandingan ini tidak berlaku untuk semua metrik atau semua ambang. Hasil ini tidak memisahkan kontribusi perubahan diskriminasi dari ketidaksesuaian kalibrasi, dan tidak menetapkan penyebab kegagalan transfer maupun menjamin bahwa kalibrasi ulang akan memulihkannya. Tumpang tindih URL persis antara blok latih dan target hanya 137 baris (0,058 %), sedangkan tumpang tindih registrable domain mencapai 21,6 % baris target; angka terakhir membatasi interpretasi dan tidak menyelamatkan kinerja. Interval bootstrap domain untuk arah balik tersedia pada artefak eksperimen 9 (F1 [0,512634; 0,586764], FPR [0,895279; 0,900180], MCC [−0,137850; −0,042795]; 1.000 replikasi, RNG seed 42, 175.509 domain). Eksperimen ini bukan evaluasi temporal karena PhiUSIIL tidak memiliki penanda waktu. Blok latih eksperimen ini berisi 372.380 baris, berbeda 167 baris dari 372.213 pada eksperimen ambang; rekonsiliasi menunjukkan selisih itu persis sama dengan jumlah duplikat URL kanonik di dalam jendela fit, karena eksperimen 9 melakukan deduplikasi pada string URL persis sedangkan jalur kanonik memakai kunci URL kanonik.</w:t>
       </w:r>
     </w:p>
     <w:p>
@@ -12480,7 +12480,7 @@
           <w:rFonts w:ascii="Times New Roman" w:hAnsi="Times New Roman" w:eastAsia="Times New Roman"/>
           <w:sz w:val="19"/>
         </w:rPr>
-        <w:t>Paket tinjauan kandidat disusun dalam lima direktori utama: 01_MANUSCRIPT (naskah kandidat dan hasil render), 02_CLAIM_EVIDENCE (audit Stage-1, QA P0, register perubahan P1, serta ledger sumber), 03_EXPERIMENTS (notebook yang telah dieksekusi beserta metrik, ledger, dan artefak run temporal kanonik), 04_ENVIRONMENT (catatan dependensi dan perintah yang diuji), dan 05_LIMITATIONS (bukti yang belum tersedia serta batas reproduksi). Setiap berkas didaftarkan pada MANIFEST.csv bersama peran, ukuran, SHA-256, dan status reproduksi; MANIFEST.sha256 memuat checksum untuk pemeriksaan mandiri. Paket ini tidak memuat korpus mentah PhiUSIIL dan PhreshPhish, biner model terlatih, pemisahan baris lengkap, prediksi per baris, arsip duplikat, dan cache yang dihasilkan alat bantu. Artefak yang dikecualikan beserta alasannya didaftarkan terpisah pada OMITTED_ARTIFACTS.csv, dengan status INCLUDED, WORKSPACE_ONLY, MISSING, OMITTED_SIZE, OMITTED_LICENSE_PRIVACY, atau NOT_REQUIRED. Karena itu paket ini adalah bundel bukti yang dapat diaudit, bukan bundel yang dapat direproduksi penuh di lingkungan bersih tanpa mengambil data dari penyedia aslinya. Salinan paket tersedia pada repositori publik https://github.com/Handy-Wibowo/supreme-sniffle dan diarsipkan dengan DOI konsep 10.5281/zenodo.23847784, dengan MANIFEST.sha256 untuk verifikasi independen; DOI konsep tersebut selalu menunjuk rilis terbaru. Penghitungan ulang artefak yang dikecualikan memerlukan run_temporal.py, design.json, dan seed yang tercatat.</w:t>
+        <w:t>Paket tinjauan kandidat disusun dalam lima direktori utama: 01_MANUSCRIPT (naskah kandidat dan hasil render), 02_CLAIM_EVIDENCE (audit Stage-1, QA P0, register perubahan P1, serta ledger sumber), 03_EXPERIMENTS (notebook yang telah dieksekusi beserta metrik, ledger, dan artefak run temporal kanonik), 04_ENVIRONMENT (catatan dependensi dan perintah yang diuji), dan 05_LIMITATIONS (bukti yang belum tersedia serta batas reproduksi). Setiap berkas didaftarkan pada MANIFEST.csv bersama peran, ukuran, SHA-256, dan status reproduksi; MANIFEST.sha256 memuat checksum untuk pemeriksaan mandiri. Paket ini tidak memuat korpus mentah PhiUSIIL dan PhreshPhish, biner model terlatih, pemisahan baris lengkap, prediksi per baris, arsip duplikat, dan cache yang dihasilkan alat bantu. Artefak yang dikecualikan beserta alasannya didaftarkan terpisah pada OMITTED_ARTIFACTS.csv, dengan status INCLUDED, WORKSPACE_ONLY, MISSING, OMITTED_SIZE, OMITTED_LICENSE_PRIVACY, atau NOT_REQUIRED. Karena itu paket ini adalah bundel bukti yang dapat diaudit, bukan bundel yang dapat direproduksi penuh di lingkungan bersih tanpa mengambil data dari penyedia aslinya. Salinan paket tersedia pada repositori publik https://github.com/Handy-Wibowo/supreme-sniffle dan diarsipkan dengan DOI konsep 10.5281/zenodo.23847784, dengan MANIFEST.sha256 untuk verifikasi independen; DOI konsep tersebut selalu menunjuk rilis terbaru. Artefak yang dikecualikan tidak dihasilkan oleh satu skrip tunggal. Pemetaan per eksperimen: benchmark PhiUSIIL (E1-E5) dibangun oleh 03_evaluation_pipeline_v2_run_complete.ipynb dengan split_random.csv dan split_sitedisjoint.csv sebagai masukan; evaluasi temporal PhreshPhish (E4) oleh run_temporal.py dengan design.json pada folder run; evaluasi ambang operasional (E7) oleh 01_operational_thresholds.executed.ipynb yang mengimpor paket src eksperimen 7; taksonomi galat (E8) oleh error_taxonomy.py; dan transfer arah balik (E9) oleh reverse_transfer.ipynb. Biner model, prediksi per baris, dan pemisahan baris lengkap dibangkitkan ulang oleh skrip masing-masing dengan seed yang tercatat, bukan oleh satu perintah bersama.</w:t>
       </w:r>
     </w:p>
     <w:p>

</xml_diff>

<commit_message>
v1.5.1: abstracts now report the reverse-transfer numbers
</commit_message>
<xml_diff>
--- a/01_MANUSCRIPT/BITS_Draft_Phishing_URL_Leakage_v10_P1_candidate.docx
+++ b/01_MANUSCRIPT/BITS_Draft_Phishing_URL_Leakage_v10_P1_candidate.docx
@@ -203,7 +203,7 @@
           <w:rFonts w:ascii="Times New Roman" w:hAnsi="Times New Roman" w:eastAsia="Times New Roman"/>
           <w:sz w:val="19"/>
         </w:rPr>
-        <w:t xml:space="preserve">. Pada PhreshPhish, A2/LightGBM mencapai rerata F1 temporal 0,800461. A2/LightGBM yang dilatih hanya pada PhiUSIIL mencapai F1 0,599064, FPR benign 0,986478, ROC-AUC 0,382566, dan MCC −0,146445 pada 168.035 URL PhreshPhish, dibandingkan F1 sumber 0,995985. Temuan ini menggambarkan portabilitas pada pasangan yang diuji dan tidak menentukan penyebab temporal. Partisi uji temporal telah diperiksa dalam pekerjaan eksploratif sebelumnya sehingga bukan holdout buta atau prospektif. Dalam refit temporal terpisah, ambang 0,884705 yang dipilih untuk memenuhi FPR validasi ≤1% menghasilkan FPR uji 1,1352% dan recall 0,5440, dibandingkan 7,6497% dan 0,7380 pada ambang 0,5. Analisis galat menemukan 37,1% dari seluruh </w:t>
+        <w:t xml:space="preserve">. Pada PhreshPhish, A2/LightGBM mencapai rerata F1 temporal 0,800461. A2/LightGBM yang dilatih hanya pada PhiUSIIL mencapai F1 0,599064, FPR benign 0,986478, ROC-AUC 0,382566, dan MCC −0,146445 pada 168.035 URL PhreshPhish, dibandingkan F1 sumber 0,995985; pada arah sebaliknya, model yang dilatih pada blok fit PhreshPhish dan diuji pada 235.370 URL PhiUSIIL mencapai F1 0,549564, FPR benign 0,897783, ROC-AUC 0,642939, dan MCC −0,092320. Temuan ini menggambarkan portabilitas pada pasangan yang diuji dan tidak menentukan penyebab temporal. Partisi uji temporal telah diperiksa dalam pekerjaan eksploratif sebelumnya sehingga bukan holdout buta atau prospektif. Dalam refit temporal terpisah, ambang 0,884705 yang dipilih untuk memenuhi FPR validasi ≤1% menghasilkan FPR uji 1,1352% dan recall 0,5440, dibandingkan 7,6497% dan 0,7380 pada ambang 0,5. Analisis galat menemukan 37,1% dari seluruh </w:t>
       </w:r>
       <w:r>
         <w:rPr>
@@ -283,7 +283,7 @@
           <w:rFonts w:ascii="Times New Roman" w:hAnsi="Times New Roman" w:eastAsia="Times New Roman"/>
           <w:sz w:val="19"/>
         </w:rPr>
-        <w:t>We examine how phishing URL detection results vary across split unit, time, and corpus using two phishing-URL datasets. The study combines a label-recoverability audit, random and site-disjoint splits, grouped feature ablation, within-corpus temporal evaluation on PhreshPhish, two-direction frozen A2 zero-shot transfer, validation-only threshold selection, and descriptive error analysis. On PhiUSIIL, A0/LightGBM achieved site-disjoint F1 0.999623; two retained features each had single-feature AUC above 0.988, consistent with descriptive benchmark saturation but not identifying its cause. PhreshPhish temporal A2/LightGBM achieved mean F1 0.800461. A2/LightGBM trained only on PhiUSIIL achieved F1 0.599064, benign FPR 0.986478, ROC-AUC 0.382566, and MCC −0.146445 on 168,035 PhreshPhish URLs, compared with source-domain F1 0.995985. These results describe portability on the tested pair and do not identify a temporal cause. The temporal test partition had previously been inspected in exploratory work and was not a blind or prospective holdout. In a separate temporal refit, threshold 0.884705 selected to meet validation FPR ≤1% yielded test FPR 1.1352% and recall 0.5440, compared with 7.6497% and 0.7380 at threshold 0.5. Error analysis found 37.1% of all false negatives in the hosting-platform category and 21.8% FPR among benign URLs ≤30 characters; these overlapping categories are descriptive, and platform-cluster uncertainty was not verified. The contribution is an auditable comparison of benchmark saturation, temporal evaluation, two-direction cross-corpus transfer, threshold trade-offs, and descriptive error patterns, not a new model or state-of-the-art claim.</w:t>
+        <w:t>We examine how phishing URL detection results vary across split unit, time, and corpus using two phishing-URL datasets. The study combines a label-recoverability audit, random and site-disjoint splits, grouped feature ablation, within-corpus temporal evaluation on PhreshPhish, two-direction frozen A2 zero-shot transfer, validation-only threshold selection, and descriptive error analysis. On PhiUSIIL, A0/LightGBM achieved site-disjoint F1 0.999623; two retained features each had single-feature AUC above 0.988, consistent with descriptive benchmark saturation but not identifying its cause. PhreshPhish temporal A2/LightGBM achieved mean F1 0.800461. A2/LightGBM trained only on PhiUSIIL achieved F1 0.599064, benign FPR 0.986478, ROC-AUC 0.382566, and MCC −0.146445 on 168,035 PhreshPhish URLs, compared with source-domain F1 0.995985; in the reverse direction, training on the PhreshPhish fit block and testing on 235,370 PhiUSIIL URLs achieved F1 0.549564, benign FPR 0.897783, ROC-AUC 0.642939, and MCC −0.092320. These results describe portability on the tested pair and do not identify a temporal cause. The temporal test partition had previously been inspected in exploratory work and was not a blind or prospective holdout. In a separate temporal refit, threshold 0.884705 selected to meet validation FPR ≤1% yielded test FPR 1.1352% and recall 0.5440, compared with 7.6497% and 0.7380 at threshold 0.5. Error analysis found 37.1% of all false negatives in the hosting-platform category and 21.8% FPR among benign URLs ≤30 characters; these overlapping categories are descriptive, and platform-cluster uncertainty was not verified. The contribution is an auditable comparison of benchmark saturation, temporal evaluation, two-direction cross-corpus transfer, threshold trade-offs, and descriptive error patterns, not a new model or state-of-the-art claim.</w:t>
       </w:r>
     </w:p>
     <w:p>

</xml_diff>

<commit_message>
v1.6.1: Gambar 2 referenced; funding statement reconciled
</commit_message>
<xml_diff>
--- a/01_MANUSCRIPT/BITS_Draft_Phishing_URL_Leakage_v10_P1_candidate.docx
+++ b/01_MANUSCRIPT/BITS_Draft_Phishing_URL_Leakage_v10_P1_candidate.docx
@@ -10003,7 +10003,7 @@
           <w:rFonts w:ascii="Times New Roman" w:hAnsi="Times New Roman" w:eastAsia="Times New Roman"/>
           <w:sz w:val="19"/>
         </w:rPr>
-        <w:t>Menurunkan FPR uji dari 7,65% menjadi 1,14% mengurangi alarm palsu dari 765 menjadi 114 per 10.000 URL benign, tetapi recall turun dari 0,738 menjadi 0,544. Target validasi 0,5% menghasilkan FPR uji 0,585% dan recall 0,475. Pola lima seed konsisten: aturan 1% menghasilkan rerata F1 0,700739, recall 0,546658, dan FPR 0,011365; aturan 0,5% menghasilkan rerata F1 0,646167, recall 0,480645, dan FPR 0,005843. Ambang tidak memperbaiki diskriminasi model; ambang hanya memindahkan biaya antara FP dan FN.</w:t>
+        <w:t>Menurunkan FPR uji dari 7,65% menjadi 1,14% mengurangi alarm palsu dari 765 menjadi 114 per 10.000 URL benign, tetapi recall turun dari 0,738 menjadi 0,544 (Gambar 2b). Target validasi 0,5% menghasilkan FPR uji 0,585% dan recall 0,475. Pola lima seed konsisten: aturan 1% menghasilkan rerata F1 0,700739, recall 0,546658, dan FPR 0,011365; aturan 0,5% menghasilkan rerata F1 0,646167, recall 0,480645, dan FPR 0,005843. Ambang tidak memperbaiki diskriminasi model; ambang hanya memindahkan biaya antara FP dan FN.</w:t>
       </w:r>
       <w:r>
         <w:rPr>
@@ -12438,7 +12438,7 @@
           <w:rFonts w:ascii="Times New Roman" w:hAnsi="Times New Roman" w:eastAsia="Times New Roman"/>
           <w:sz w:val="19"/>
         </w:rPr>
-        <w:t>Perolehan Pendanaan: tidak ada.</w:t>
+        <w:t>Perolehan Pendanaan: tidak ada dana eksternal; penelitian didanai mandiri oleh para penulis.</w:t>
       </w:r>
     </w:p>
     <w:p>

</xml_diff>

<commit_message>
v1.7.0: review-3 fixes (T10 operands, t-CI artefact, 167-row reconciliation, S3.6/S3.3/Table1 corrections)
</commit_message>
<xml_diff>
--- a/01_MANUSCRIPT/BITS_Draft_Phishing_URL_Leakage_v10_P1_candidate.docx
+++ b/01_MANUSCRIPT/BITS_Draft_Phishing_URL_Leakage_v10_P1_candidate.docx
@@ -188,7 +188,7 @@
           <w:rFonts w:ascii="Times New Roman" w:hAnsi="Times New Roman" w:eastAsia="Times New Roman"/>
           <w:sz w:val="19"/>
         </w:rPr>
-        <w:t>; dua fitur yang dipertahankan masing-masing memiliki AUC tunggal di atas 0,988, konsisten dengan saturasi benchmark deskriptif tetapi tidak mengidentifikasi peny</w:t>
+        <w:t>; dua fitur yang dipertahankan masing-masing memiliki AUC tunggal sekitar 0,988 atau lebih, konsisten dengan saturasi benchmark deskriptif tetapi tidak mengidentifikasi peny</w:t>
       </w:r>
       <w:r>
         <w:rPr>
@@ -679,7 +679,7 @@
                 <w:rFonts w:ascii="Times New Roman" w:hAnsi="Times New Roman" w:eastAsia="Times New Roman"/>
                 <w:sz w:val="14"/>
               </w:rPr>
-              <w:t>Tanpa desain temporal; protokol ambang tidak dilaporkan pada abstrak</w:t>
+              <w:t>Menguji ulang metode pada dataset baru dan beragam, termasuk pengaruh rasio kelas; menyatakan pelatihan ulang saja tidak cukup menghadapi serangan baru; protokol ambang tidak dilaporkan pada abstrak</w:t>
             </w:r>
           </w:p>
         </w:tc>
@@ -934,7 +934,7 @@
                 <w:rFonts w:ascii="Times New Roman" w:hAnsi="Times New Roman" w:eastAsia="Times New Roman"/>
                 <w:sz w:val="14"/>
               </w:rPr>
-              <w:t>Tanpa desain temporal atau transfer lintas korpus</w:t>
+              <w:t>Membandingkan protokol evaluasi pada beberapa dataset; tidak melaporkan transfer lintas korpus</w:t>
             </w:r>
           </w:p>
         </w:tc>
@@ -2000,7 +2000,7 @@
           <w:rFonts w:ascii="Times New Roman" w:hAnsi="Times New Roman" w:eastAsia="Times New Roman"/>
           <w:sz w:val="19"/>
         </w:rPr>
-        <w:t>Dataset PhreshPhish, yang saat ini dideskripsikan dalam sebuah preprint [2], digunakan untuk dua peran yang tidak dicampur: evaluasi temporal dalam-korpus dan target transfer lintas-korpus. Korpus ini dikumpulkan melalui pipeline, vendor, dan jendela waktu yang berbeda dari PhiUSIIL. Evaluasi temporal melatih model pada periode awal PhreshPhish, sedangkan transfer lintas-korpus melatih model hanya pada PhiUSIIL dan menggunakan kohort uji PhreshPhish sebagai target tanpa adaptasi. Perbandingan tetap tidak mengisolasi penyebab pergeseran distribusi.</w:t>
+        <w:t>Dataset PhreshPhish, yang saat ini dideskripsikan dalam sebuah preprint [2], digunakan untuk dua peran yang tidak dicampur: evaluasi temporal dalam-korpus dan target transfer lintas-korpus. Korpus ini dikumpulkan melalui pipeline, vendor, dan jendela waktu yang berbeda dari PhiUSIIL. Evaluasi temporal melatih model pada periode awal PhreshPhish, sedangkan transfer lintas-korpus dijalankan dua arah: arah maju melatih model hanya pada PhiUSIIL dan menggunakan kohort uji PhreshPhish sebagai target tanpa adaptasi, dan arah balik melatih model hanya pada blok fit PhreshPhish dengan deduplikasi string URL persis lalu menguji pada PhiUSIIL tanpa adaptasi. Perbandingan tetap tidak mengisolasi penyebab pergeseran distribusi.</w:t>
       </w:r>
     </w:p>
     <w:p>
@@ -3150,7 +3150,7 @@
           <w:rFonts w:ascii="Times New Roman" w:hAnsi="Times New Roman" w:eastAsia="Times New Roman"/>
           <w:sz w:val="19"/>
         </w:rPr>
-        <w:t xml:space="preserve">Interval kepercayaan 95 % untuk rata-rata lintas seed dihitung dengan distribusi t (df = 4). Untuk perbandingan berpasangan A1−A0, digunakan </w:t>
+        <w:t xml:space="preserve">Interval kepercayaan 95 % untuk rata-rata lintas seed dihitung dengan distribusi t (df = 4) dari lima metrik per seed, dan tersedia sebagai seed_t_intervals.csv pada folder keluaran eksperimen 5; variasi yang tercakup juga meliputi perubahan partisi pada benchmark. Untuk perbandingan berpasangan A1−A0, digunakan </w:t>
       </w:r>
       <w:r>
         <w:rPr>
@@ -3596,7 +3596,7 @@
           <w:rFonts w:ascii="Times New Roman" w:hAnsi="Times New Roman" w:eastAsia="Times New Roman"/>
           <w:sz w:val="19"/>
         </w:rPr>
-        <w:t xml:space="preserve"> dalam A0. Dengan demikian, konfigurasi acuan 47 fitur memuat dua kolom dengan AUC tunggal di atas 0,988, yang menunjukkan separabilitas tinggi pada korpus berlabel. Hal ini tidak menunjukkan bahwa salah satu kolom diturunkan dari label atau menyebabkan hasil model yang mendekati plafon. Nilai F1 0,9996–0,9998 adalah hasil benchmark yang teramati; bukti yang tersedia tidak memisahkan kontribusi pemodelan, nilai fitur tersimpan, label sumber, maupun proses pengumpulan data.</w:t>
+        <w:t xml:space="preserve"> dalam A0. Dengan demikian, konfigurasi acuan 47 fitur memuat dua kolom dengan AUC tunggal sekitar 0,988 atau lebih, yang menunjukkan separabilitas tinggi pada korpus berlabel. Hal ini tidak menunjukkan bahwa salah satu kolom diturunkan dari label atau menyebabkan hasil model yang mendekati plafon. Nilai F1 0,9996–0,9998 adalah hasil benchmark yang teramati; bukti yang tersedia tidak memisahkan kontribusi pemodelan, nilai fitur tersimpan, label sumber, maupun proses pengumpulan data.</w:t>
       </w:r>
     </w:p>
     <w:p>
@@ -4446,7 +4446,7 @@
           <w:rFonts w:ascii="Times New Roman" w:hAnsi="Times New Roman" w:eastAsia="Times New Roman"/>
           <w:sz w:val="19"/>
         </w:rPr>
-        <w:t>Selisih rerata antarprotokol berada pada rentang 0,000163 sampai 0,001178 dalam F1, bergantung pada model dan konfigurasi. Untuk A0/LightGBM selisihnya 0,000203; untuk A0/XGBoost 0,000163. Interval kepercayaan 95 % berbasis t (df = 4) pada masing-masing protokol dilaporkan untuk menunjukkan variasi lintas seed, bukan untuk menguji selisih lintas protokol. Perbandingan antarprotokol di sini bersifat deskriptif: tidak ada uji berpasangan lintas protokol yang dijalankan karena partisi ujinya berbeda dan bukan pasangan baris yang sama. Tumpang tindih interval juga tidak diperlakukan sebagai bukti ekuivalensi.</w:t>
+        <w:t>Selisih rerata antarprotokol berada pada rentang 0,000162 sampai 0,001178 dalam F1, bergantung pada model dan konfigurasi. Untuk A0/LightGBM selisihnya 0,000203; untuk A0/XGBoost 0,000162, dihitung dari nilai tak-terbulatkan pada summary.csv eksperimen 5. Interval kepercayaan 95 % berbasis t (df = 4) pada masing-masing protokol dilaporkan untuk menunjukkan variasi lintas seed, bukan untuk menguji selisih lintas protokol. Perbandingan antarprotokol di sini bersifat deskriptif: tidak ada uji berpasangan lintas protokol yang dijalankan karena partisi ujinya berbeda dan bukan pasangan baris yang sama. Tumpang tindih interval juga tidak diperlakukan sebagai bukti ekuivalensi.</w:t>
       </w:r>
       <w:r>
         <w:rPr>
@@ -4525,7 +4525,7 @@
           <w:rFonts w:ascii="Times New Roman" w:hAnsi="Times New Roman" w:eastAsia="Times New Roman"/>
           <w:sz w:val="19"/>
         </w:rPr>
-        <w:t>Studi metodologis menekankan bahwa pengaruh protokol bergantung pada unit independensi dan karakteristik dataset [3], [5], [6]. Pada PhiUSIIL, dua kolom A0 memiliki AUC tunggal di atas 0,988, sementara F1 teramati mendekati satu. Pola ini konsisten dengan saturasi benchmark deskriptif, tetapi penelitian ini tidak menguji apakah fitur, konstruksi label, pengumpulan data, paparan domain, atau faktor lain menyebabkannya; interpretasi ters</w:t>
+        <w:t>Studi metodologis menekankan bahwa pengaruh protokol bergantung pada unit independensi dan karakteristik dataset [3], [5], [6]. Pada PhiUSIIL, dua kolom A0 memiliki AUC tunggal sekitar 0,988 atau lebih, sementara F1 teramati mendekati satu. Pola ini konsisten dengan saturasi benchmark deskriptif, tetapi penelitian ini tidak menguji apakah fitur, konstruksi label, pengumpulan data, paparan domain, atau faktor lain menyebabkannya; interpretasi ters</w:t>
       </w:r>
       <w:r>
         <w:rPr>
@@ -5350,7 +5350,7 @@
           <w:rFonts w:ascii="Times New Roman" w:hAnsi="Times New Roman" w:eastAsia="Times New Roman"/>
           <w:sz w:val="19"/>
         </w:rPr>
-        <w:t xml:space="preserve"> Spesifikasi perangkat keras dan jumlah thread tidak dicatat pada artefak, sehingga angka waktu tersebut adalah log eksekusi, bukan pembandingan biaya komputasi.</w:t>
+        <w:t xml:space="preserve"> Metadata eksekusi mencatat 16 CPU logis dan konfigurasi n_jobs, tetapi jumlah thread efektif, kapasitas RAM, dan beban sistem saat eksekusi tidak dicatat; karena itu angka waktu tersebut adalah log eksekusi, bukan pembandingan biaya komputasi.</w:t>
       </w:r>
     </w:p>
     <w:p>
@@ -7487,14 +7487,13 @@
           <w:rFonts w:ascii="Times New Roman" w:hAnsi="Times New Roman" w:eastAsia="Times New Roman"/>
           <w:sz w:val="19"/>
         </w:rPr>
-        <w:t>Lebih penting lagi, evaluasi temporal pada PhreshPhish tidak dapat dipisahkan dari dua sumber perancu. Pertama, faktor temporal: periode uji berasal dari waktu yang lebih akhir daripada periode latih. Kedua, faktor populasi dan vendor: korpus PhreshPhish dikumpulkan melalui pipeline dan vendor yang berbeda dari PhiUSIIL, sehingga perbedaan distribusi antara kedua korpus dapat berasal dari perbedaan sumber pengumpulan, bukan dari perubahan perilaku penyerang seiring waktu. Perancu vendor ini berlaku pada perbandingan lintas korpus PhiUSIIL–PhreshPhish, bukan pada perbandingan antarbulan di dalam PhreshPhish, karena seluruh blok temporal PhreshPhish berasal dari sumber pengumpulan yang sama. Kedua sumber perancu ini bercampur dan tidak dapat dipisahkan dengan data yang tersedia. Klaim yang sah adalah "model A2 yang dilatih pada periode awal memperoleh F1 0,800 pada periode akhir korpus PhreshPhish", bukan "kinerja model menurun 20 poin karena waktu".</w:t>
-      </w:r>
-      <w:r>
-        <w:rPr>
-          <w:rFonts w:ascii="Times New Roman" w:hAnsi="Times New Roman" w:eastAsia="Times New Roman"/>
-          <w:sz w:val="19"/>
-        </w:rPr>
-        <w:t xml:space="preserve"> Perlu ditegaskan bahwa perbedaan vendor dan pipeline merupakan perancu perbandingan lintas korpus PhiUSIIL–PhreshPhish, bukan perancu perbandingan antarbulan di dalam PhreshPhish, karena seluruh blok temporal PhreshPhish berasal dari sumber pengumpulan yang sama.</w:t>
+        <w:t>Lebih penting lagi, evaluasi temporal pada PhreshPhish tidak dapat dipisahkan dari faktor temporal: periode uji berasal dari waktu yang lebih akhir daripada periode latih, sehingga perbedaan kinerja antara periode awal dan akhir tidak dapat diatribusikan kepada waktu saja. Perbandingan lintas korpus PhiUSIIL–PhreshPhish membawa perancu tambahan yang berbeda sifatnya, yaitu pipeline dan vendor pengumpulan yang berbeda, dan perancu tersebut berlaku pada perbandingan lintas korpus itu, bukan pada perbandingan antarbulan di dalam PhreshPhish. Kedua jenis perancu ini bercampur dan tidak dapat dipisahkan dengan data yang tersedia. Klaim yang sah adalah "model A2 yang dilatih pada periode awal memperoleh F1 0,800 pada periode akhir korpus PhreshPhish", bukan "kinerja model menurun 20 poin karena waktu".</w:t>
+      </w:r>
+      <w:r>
+        <w:rPr>
+          <w:rFonts w:ascii="Times New Roman" w:hAnsi="Times New Roman" w:eastAsia="Times New Roman"/>
+          <w:sz w:val="19"/>
+        </w:rPr>
       </w:r>
     </w:p>
     <w:p>
@@ -11203,7 +11202,7 @@
                 <w:rFonts w:ascii="Times New Roman" w:hAnsi="Times New Roman"/>
                 <w:sz w:val="14"/>
               </w:rPr>
-              <w:t>summary.csv (eksperimen 5): 0,999811573 − 0,999649117</w:t>
+              <w:t>summary.csv (eksperimen 5): 0,999855755 − 0,999693299</w:t>
             </w:r>
           </w:p>
         </w:tc>
@@ -12029,7 +12028,7 @@
           <w:rFonts w:ascii="Times New Roman" w:hAnsi="Times New Roman" w:eastAsia="Times New Roman"/>
           <w:sz w:val="19"/>
         </w:rPr>
-        <w:t>Temuan audit konsisten dengan literatur yang menempatkan desain dataset, ketidakmandirian sampel, dan stabilitas fitur sebagai ancaman terhadap generalisasi [2], [3], [5], [6], [9]. Pada PhiUSIIL, selisih rerata teramati antarprotokol kecil, yaitu 0,0002–0,0012 dalam F1; nilai ini tidak dibandingkan secara numerik dengan studi yang menggunakan korpus atau protokol berbeda. Dua kolom A0 memiliki AUC tunggal di atas 0,988 sementara metrik A0 teramati mendekati satu. Pola ini konsisten dengan saturasi benchmark deskriptif, tetapi penelitian tidak menetapkan mekanismenya atau memisahkan kontribusi relatif fitur dan paparan domain. Nilai AUC menunjukkan separabilitas kelas saja; nilai tersebut tidak menunjukkan bahwa fitur tersimpan independen dari label atau paparan domain.</w:t>
+        <w:t>Temuan audit konsisten dengan literatur yang menempatkan desain dataset, ketidakmandirian sampel, dan stabilitas fitur sebagai ancaman terhadap generalisasi [2], [3], [5], [6], [9]. Pada PhiUSIIL, selisih rerata teramati antarprotokol kecil, yaitu 0,0002–0,0012 dalam F1; nilai ini tidak dibandingkan secara numerik dengan studi yang menggunakan korpus atau protokol berbeda. Dua kolom A0 memiliki AUC tunggal sekitar 0,988 atau lebih, sementara metrik A0 teramati mendekati satu. Pola ini konsisten dengan saturasi benchmark deskriptif, tetapi penelitian tidak menetapkan mekanismenya atau memisahkan kontribusi relatif fitur dan paparan domain. Nilai AUC menunjukkan separabilitas kelas saja; nilai tersebut tidak menunjukkan bahwa fitur tersimpan independen dari label atau paparan domain.</w:t>
       </w:r>
     </w:p>
     <w:p>
@@ -12158,7 +12157,7 @@
           <w:rFonts w:ascii="Times New Roman" w:hAnsi="Times New Roman" w:eastAsia="Times New Roman"/>
           <w:sz w:val="19"/>
         </w:rPr>
-        <w:t xml:space="preserve"> adalah 0,999623 bersama dua fitur yang dipertahankan dengan AUC tunggal di atas 0,988. Kontras kelompok A1−A0 sekitar seperseribu F1. Temuan ini menggambarkan saturasi pada benchmark tersebut; penelitian tidak menetapkan penyebabnya.</w:t>
+        <w:t xml:space="preserve"> adalah 0,999623 bersama dua fitur yang dipertahankan dengan AUC tunggal sekitar 0,988 atau lebih. Kontras kelompok A1−A0 sekitar seperseribu F1. Temuan ini menggambarkan saturasi pada benchmark tersebut; penelitian tidak menetapkan penyebabnya.</w:t>
       </w:r>
     </w:p>
     <w:p>
@@ -12480,7 +12479,7 @@
           <w:rFonts w:ascii="Times New Roman" w:hAnsi="Times New Roman" w:eastAsia="Times New Roman"/>
           <w:sz w:val="19"/>
         </w:rPr>
-        <w:t>Paket tinjauan kandidat disusun dalam lima direktori utama: 01_MANUSCRIPT (naskah kandidat dan hasil render), 02_CLAIM_EVIDENCE (audit Stage-1, QA P0, register perubahan P1, serta ledger sumber), 03_EXPERIMENTS (notebook yang telah dieksekusi beserta metrik, ledger, dan artefak run temporal kanonik), 04_ENVIRONMENT (catatan dependensi dan perintah yang diuji), dan 05_LIMITATIONS (bukti yang belum tersedia serta batas reproduksi). Setiap berkas didaftarkan pada MANIFEST.csv bersama peran, ukuran, SHA-256, dan status reproduksi; MANIFEST.sha256 memuat checksum untuk pemeriksaan mandiri. Paket ini tidak memuat korpus mentah PhiUSIIL dan PhreshPhish, biner model terlatih, pemisahan baris lengkap, prediksi per baris, arsip duplikat, dan cache yang dihasilkan alat bantu. Artefak yang dikecualikan beserta alasannya didaftarkan terpisah pada OMITTED_ARTIFACTS.csv, dengan status INCLUDED, WORKSPACE_ONLY, MISSING, OMITTED_SIZE, OMITTED_LICENSE_PRIVACY, atau NOT_REQUIRED. Karena itu paket ini adalah bundel bukti yang dapat diaudit, bukan bundel yang dapat direproduksi penuh di lingkungan bersih tanpa mengambil data dari penyedia aslinya. Salinan paket tersedia pada repositori publik https://github.com/Handy-Wibowo/supreme-sniffle dan diarsipkan dengan DOI konsep 10.5281/zenodo.23847784, dengan MANIFEST.sha256 untuk verifikasi independen; DOI konsep tersebut selalu menunjuk rilis terbaru. Artefak yang dikecualikan tidak dihasilkan oleh satu skrip tunggal. Pemetaan per eksperimen: benchmark PhiUSIIL (E1-E5) dibangun oleh 03_evaluation_pipeline_v2_run_complete.ipynb dengan split_random.csv dan split_sitedisjoint.csv sebagai masukan; evaluasi temporal PhreshPhish (E4) oleh run_temporal.py dengan design.json pada folder run; evaluasi ambang operasional (E7) oleh 01_operational_thresholds.executed.ipynb yang mengimpor paket src eksperimen 7; taksonomi galat (E8) oleh error_taxonomy.py; dan transfer arah balik (E9) oleh reverse_transfer.ipynb. Biner model, prediksi per baris, dan pemisahan baris lengkap dibangkitkan ulang oleh skrip masing-masing dengan seed yang tercatat, bukan oleh satu perintah bersama.</w:t>
+        <w:t>Paket tinjauan kandidat disusun dalam lima direktori utama: 01_MANUSCRIPT (naskah kandidat dan hasil render), 02_CLAIM_EVIDENCE (audit Stage-1, QA P0, register perubahan P1, serta ledger sumber), 03_EXPERIMENTS (notebook yang telah dieksekusi beserta metrik, ledger, dan artefak run temporal kanonik), 04_ENVIRONMENT (catatan dependensi dan perintah yang diuji), dan 05_LIMITATIONS (bukti yang belum tersedia serta batas reproduksi). Setiap berkas didaftarkan pada MANIFEST.csv bersama peran, ukuran, SHA-256, dan status reproduksi; MANIFEST.sha256 memuat checksum untuk pemeriksaan mandiri. Paket ini tidak memuat korpus mentah PhiUSIIL dan PhreshPhish, biner model terlatih, pemisahan baris lengkap, prediksi per baris, arsip duplikat, dan cache yang dihasilkan alat bantu. Artefak yang dikecualikan beserta alasannya didaftarkan terpisah pada OMITTED_ARTIFACTS.csv, dengan status INCLUDED, WORKSPACE_ONLY, MISSING, OMITTED_SIZE, OMITTED_LICENSE_PRIVACY, atau NOT_REQUIRED. Karena itu paket ini adalah bundel bukti yang dapat diaudit, bukan bundel yang dapat direproduksi penuh di lingkungan bersih tanpa mengambil data dari penyedia aslinya. Salinan paket tersedia pada repositori publik https://github.com/Handy-Wibowo/supreme-sniffle dan diarsipkan dengan DOI konsep 10.5281/zenodo.23847784, dengan MANIFEST.sha256 untuk verifikasi independen; DOI konsep tersebut selalu menunjuk rilis terbaru. Artefak yang dikecualikan tidak dihasilkan oleh satu skrip tunggal, dan pemetaan berikut menyebut artefak yang benar-benar tersedia. Pembersihan dan pembagian PhiUSIIL disiapkan oleh notebook tahap awal, dengan split_random.csv dan split_sitedisjoint.csv sebagai manifest ID-fold yang menjadi masukan setiap arm. Benchmark A0/A1/A2 dan ablasi dibangkitkan oleh paired_bootstrap_E4/src/run_experiment.py dan diringkas oleh paired_bootstrap_E4/src/summarize.py; nama folder historis E4 tidak berarti notebook E3 menghasilkan benchmark final, dan notebook 03_evaluation_pipeline_v2_run_complete.ipynb memakai keluarga fitur serta konvensi label yang berbeda sehingga tidak dipakai untuk metrik positif-phishing. Evaluasi temporal memakai temporal_scripts/run_temporal.py untuk jalur kanonik, sedangkan interval yang dikutip Tabel 6 berasal dari paired_bootstrap_E4/bootstrap_temporal.csv. Transfer maju dijalankan oleh Exp6_Cross_Corpus/transfer.executed.ipynb; evaluasi ambang oleh Exp7_Operational_Threshold/01_operational_thresholds.executed.ipynb dengan paket src eksperimen 7; taksonomi galat oleh Exp8_Error_Taxonomy/error_taxonomy.executed.ipynb; dan transfer balik oleh Exp9_reverse_transfer/reverse_transfer.ipynb. Kedua manifest split memuat 1.176.850 baris, yaitu lima seed kali 235.370 URL; yang tidak dibundel adalah data mentah, biner model, dan prediksi per baris, bukan manifest ID-fold. Snapshot arsip yang dirujuk adalah DOI versi 10.5281/zenodo.23860185 di bawah DOI konsep 10.5281/zenodo.23847784.</w:t>
       </w:r>
     </w:p>
     <w:p>

</xml_diff>

<commit_message>
v1.7.2: timing rows name the canonical run ID
</commit_message>
<xml_diff>
--- a/01_MANUSCRIPT/BITS_Draft_Phishing_URL_Leakage_v10_P1_candidate.docx
+++ b/01_MANUSCRIPT/BITS_Draft_Phishing_URL_Leakage_v10_P1_candidate.docx
@@ -11626,7 +11626,7 @@
                 <w:rFonts w:ascii="Times New Roman" w:hAnsi="Times New Roman"/>
                 <w:sz w:val="14"/>
               </w:rPr>
-              <w:t>results_per_seed.csv</w:t>
+              <w:t>results_per_seed.csv (run 20261022T170935017991Z, run kanonik)</w:t>
             </w:r>
           </w:p>
         </w:tc>
@@ -11679,7 +11679,7 @@
                 <w:rFonts w:ascii="Times New Roman" w:hAnsi="Times New Roman"/>
                 <w:sz w:val="14"/>
               </w:rPr>
-              <w:t>results_per_seed.csv</w:t>
+              <w:t>results_per_seed.csv (run 20261022T170935017991Z, run kanonik)</w:t>
             </w:r>
           </w:p>
         </w:tc>

</xml_diff>

<commit_message>
v1.8.0: round-2 audit fixes (EN abstract, t-CI provenance, T6 source, Sep prevalence, duplicate sentence)
</commit_message>
<xml_diff>
--- a/01_MANUSCRIPT/BITS_Draft_Phishing_URL_Leakage_v10_P1_candidate.docx
+++ b/01_MANUSCRIPT/BITS_Draft_Phishing_URL_Leakage_v10_P1_candidate.docx
@@ -283,7 +283,7 @@
           <w:rFonts w:ascii="Times New Roman" w:hAnsi="Times New Roman" w:eastAsia="Times New Roman"/>
           <w:sz w:val="19"/>
         </w:rPr>
-        <w:t>We examine how phishing URL detection results vary across split unit, time, and corpus using two phishing-URL datasets. The study combines a label-recoverability audit, random and site-disjoint splits, grouped feature ablation, within-corpus temporal evaluation on PhreshPhish, two-direction frozen A2 zero-shot transfer, validation-only threshold selection, and descriptive error analysis. On PhiUSIIL, A0/LightGBM achieved site-disjoint F1 0.999623; two retained features each had single-feature AUC above 0.988, consistent with descriptive benchmark saturation but not identifying its cause. PhreshPhish temporal A2/LightGBM achieved mean F1 0.800461. A2/LightGBM trained only on PhiUSIIL achieved F1 0.599064, benign FPR 0.986478, ROC-AUC 0.382566, and MCC −0.146445 on 168,035 PhreshPhish URLs, compared with source-domain F1 0.995985; in the reverse direction, training on the PhreshPhish fit block and testing on 235,370 PhiUSIIL URLs achieved F1 0.549564, benign FPR 0.897783, ROC-AUC 0.642939, and MCC −0.092320. These results describe portability on the tested pair and do not identify a temporal cause. The temporal test partition had previously been inspected in exploratory work and was not a blind or prospective holdout. In a separate temporal refit, threshold 0.884705 selected to meet validation FPR ≤1% yielded test FPR 1.1352% and recall 0.5440, compared with 7.6497% and 0.7380 at threshold 0.5. Error analysis found 37.1% of all false negatives in the hosting-platform category and 21.8% FPR among benign URLs ≤30 characters; these overlapping categories are descriptive, and platform-cluster uncertainty was not verified. The contribution is an auditable comparison of benchmark saturation, temporal evaluation, two-direction cross-corpus transfer, threshold trade-offs, and descriptive error patterns, not a new model or state-of-the-art claim.</w:t>
+        <w:t>We examine how phishing URL detection results vary across split unit, time, and corpus using two phishing-URL datasets. The study combines a label-recoverability audit, random and site-disjoint splits, grouped feature ablation, within-corpus temporal evaluation on PhreshPhish, two-direction frozen A2 zero-shot transfer, validation-only threshold selection, and descriptive error analysis. On PhiUSIIL, A0/LightGBM achieved site-disjoint F1 0.999623; two retained features each had single-feature AUC of about 0.988 or more, consistent with descriptive benchmark saturation but not identifying its cause. PhreshPhish temporal A2/LightGBM achieved mean F1 0.800461. A2/LightGBM trained only on PhiUSIIL achieved F1 0.599064, benign FPR 0.986478, ROC-AUC 0.382566, and MCC −0.146445 on 168,035 PhreshPhish URLs, compared with source-domain F1 0.995985; in the reverse direction, training on the PhreshPhish fit block and testing on 235,370 PhiUSIIL URLs achieved F1 0.549564, benign FPR 0.897783, ROC-AUC 0.642939, and MCC −0.092320. These results describe portability on the tested pair and do not identify a temporal cause. The temporal test partition had previously been inspected in exploratory work and was not a blind or prospective holdout. In a separate temporal refit, threshold 0.884705 selected to meet validation FPR ≤1% yielded test FPR 1.1352% and recall 0.5440, compared with 7.6497% and 0.7380 at threshold 0.5. Error analysis found 37.1% of all false negatives in the hosting-platform category and 21.8% FPR among benign URLs ≤30 characters; these overlapping categories are descriptive, and platform-cluster uncertainty was not verified. The contribution is an auditable comparison of benchmark saturation, temporal evaluation, two-direction cross-corpus transfer, threshold trade-offs, and descriptive error patterns, not a new model or state-of-the-art claim.</w:t>
       </w:r>
     </w:p>
     <w:p>
@@ -3202,7 +3202,7 @@
           <w:rFonts w:ascii="Times New Roman" w:hAnsi="Times New Roman" w:eastAsia="Times New Roman"/>
           <w:sz w:val="19"/>
         </w:rPr>
-        <w:t xml:space="preserve"> Kembali ke perbandingan A1−A0: titik estimasinya adalah nilai model seed 42, bukan rerata lima seed pada Tabel 4; seed 42 di sini berperan sebagai seed model, sedangkan seed 42 pada bootstrap berperan sebagai seed RNG resampling. Karena itu selisih pada Tabel 5 dan selisih rerata pada Tabel 4 memang berbeda dan tidak boleh dibandingkan langsung. Untuk evaluasi temporal, interval dihitung dengan bootstrap pada unit registrable domain, 1.000 replikasi, dan seed RNG bootstrap 42, diterapkan pada prediksi model seed 13; angka 13 pada Tabel 6 menandai seed model, bukan seed RNG bootstrap.</w:t>
+        <w:t xml:space="preserve"> Kembali ke perbandingan A1−A0: titik estimasinya adalah nilai model seed 42, bukan rerata lima seed pada Tabel 4; seed 42 di sini berperan sebagai seed model, sedangkan seed 42 pada bootstrap berperan sebagai seed RNG resampling. Karena itu selisih pada Tabel 5 dan selisih rerata pada Tabel 4 memang berbeda dan tidak boleh dibandingkan langsung.</w:t>
       </w:r>
     </w:p>
     <w:p>
@@ -4446,14 +4446,7 @@
           <w:rFonts w:ascii="Times New Roman" w:hAnsi="Times New Roman" w:eastAsia="Times New Roman"/>
           <w:sz w:val="19"/>
         </w:rPr>
-        <w:t>Selisih rerata antarprotokol berada pada rentang 0,000162 sampai 0,001178 dalam F1, bergantung pada model dan konfigurasi. Untuk A0/LightGBM selisihnya 0,000203; untuk A0/XGBoost 0,000162, dihitung dari nilai tak-terbulatkan pada summary.csv eksperimen 5. Interval kepercayaan 95 % berbasis t (df = 4) pada masing-masing protokol dilaporkan untuk menunjukkan variasi lintas seed, bukan untuk menguji selisih lintas protokol. Perbandingan antarprotokol di sini bersifat deskriptif: tidak ada uji berpasangan lintas protokol yang dijalankan karena partisi ujinya berbeda dan bukan pasangan baris yang sama. Tumpang tindih interval juga tidak diperlakukan sebagai bukti ekuivalensi.</w:t>
-      </w:r>
-      <w:r>
-        <w:rPr>
-          <w:rFonts w:ascii="Times New Roman" w:hAnsi="Times New Roman" w:eastAsia="Times New Roman"/>
-          <w:sz w:val="19"/>
-        </w:rPr>
-        <w:t xml:space="preserve"> Nilai interval tersebut tersimpan pada berkas metrik per seed dan tidak ditabulasikan dalam artikel ini.</w:t>
+        <w:t>Selisih rerata antarprotokol berada pada rentang 0,000162 sampai 0,001178 dalam F1, bergantung pada model dan konfigurasi. Untuk A0/LightGBM selisihnya 0,000203; untuk A0/XGBoost 0,000162, dihitung dari nilai tak-terbulatkan pada summary.csv eksperimen 5. Interval kepercayaan 95 % berbasis t (df = 4) pada masing-masing protokol dihitung dan tersedia pada seed_t_intervals.csv eksperimen 5, tidak ditabulasikan dalam artikel ini; interval tersebut menunjukkan variasi lintas seed, bukan menguji selisih lintas protokol. Perbandingan antarprotokol di sini bersifat deskriptif: tidak ada uji berpasangan lintas protokol yang dijalankan karena partisi ujinya berbeda dan bukan pasangan baris yang sama. Tumpang tindih interval juga tidak diperlakukan sebagai bukti ekuivalensi.</w:t>
       </w:r>
     </w:p>
     <w:p>
@@ -6767,7 +6760,7 @@
           <w:rFonts w:ascii="Times New Roman" w:hAnsi="Times New Roman" w:eastAsia="Times New Roman"/>
           <w:sz w:val="17"/>
         </w:rPr>
-        <w:t xml:space="preserve"> Model dilatih pada seluruh blok pra-cutoff, yaitu periode fit dan validasi (497.359 baris), dengan ambang 0,5.</w:t>
+        <w:t xml:space="preserve"> Model dilatih pada seluruh blok pra-cutoff, yaitu periode fit dan validasi (497.359 baris), dengan ambang 0,5. Batas interval diambil dari bootstrap_temporal.csv eksperimen 5; berkas cluster_bootstrap_primary_seed.csv pada folder eksperimen 4 memuat interval berbeda untuk estimasi yang sama dan tidak dipakai di sini.</w:t>
       </w:r>
     </w:p>
     <w:tbl>
@@ -7416,7 +7409,7 @@
           <w:rFonts w:ascii="Times New Roman" w:hAnsi="Times New Roman" w:eastAsia="Times New Roman"/>
           <w:sz w:val="19"/>
         </w:rPr>
-        <w:t>Tiga hal perlu dibaca bersama. Pertama, precision tinggi (0,907) sementara recall jauh lebih rendah (0,718). Pada periode uji dengan prevalensi phishing 45,7 %, precision tinggi sebagian merupakan konsekuensi komposisi kelas, bukan bukti kualitas model. Kedua, FPR berada pada skala persen (6,17 %), bukan pecahan persen seperti pada PhiUSIIL (0,011 %). Ketiga, komposisi kelas berubah drastis antarbulan di dalam periode uji: prevalensi phishing 13,48 % pada September 2025, 46,75 % pada Oktober, 90,08 % pada November, dan 0 % pada Desember. F1 agregat karena itu mencampur rezim yang sangat berbeda. Pada Desember 2025, yang hanya berisi 1.017 baris benign tanpa satu pun baris phishing, F1 dan recall tidak terdefinisi; FPR pada bulan itu 0,124877. Angka tersebut dilaporkan sebagai peringatan pembacaan, bukan sebagai hasil utama.</w:t>
+        <w:t>Tiga hal perlu dibaca bersama. Pertama, precision tinggi (0,907) sementara recall jauh lebih rendah (0,718). Pada periode uji dengan prevalensi phishing 45,7 %, precision tinggi sebagian merupakan konsekuensi komposisi kelas, bukan bukti kualitas model. Kedua, FPR berada pada skala persen (6,17 %), bukan pecahan persen seperti pada PhiUSIIL (0,011 %). Ketiga, komposisi kelas berubah drastis antarbulan di dalam periode uji: prevalensi phishing 13,47 % pada September 2025, 46,75 % pada Oktober, 90,08 % pada November, dan 0 % pada Desember. F1 agregat karena itu mencampur rezim yang sangat berbeda. Pada Desember 2025, yang hanya berisi 1.017 baris benign tanpa satu pun baris phishing, F1 dan recall tidak terdefinisi; FPR pada bulan itu 0,124877. Angka tersebut dilaporkan sebagai peringatan pembacaan, bukan sebagai hasil utama.</w:t>
       </w:r>
     </w:p>
     <w:p>

</xml_diff>

<commit_message>
v1.8.2: Table 1 [11][12] corrected; all abstract numbers tabulated in Table 10
</commit_message>
<xml_diff>
--- a/01_MANUSCRIPT/BITS_Draft_Phishing_URL_Leakage_v10_P1_candidate.docx
+++ b/01_MANUSCRIPT/BITS_Draft_Phishing_URL_Leakage_v10_P1_candidate.docx
@@ -934,7 +934,7 @@
                 <w:rFonts w:ascii="Times New Roman" w:hAnsi="Times New Roman" w:eastAsia="Times New Roman"/>
                 <w:sz w:val="14"/>
               </w:rPr>
-              <w:t>Membandingkan protokol evaluasi pada beberapa dataset; tidak melaporkan transfer lintas korpus</w:t>
+              <w:t>Pembagian dalam-korpus pada satu dataset per studi (80/20 berstrata pada [11]; 70/30 pada [12]); tidak ada pemisahan berbasis waktu dan tidak ada transfer lintas korpus</w:t>
             </w:r>
           </w:p>
         </w:tc>
@@ -11938,6 +11938,271 @@
                 <w:sz w:val="14"/>
               </w:rPr>
               <w:t>phiusiil_leakage_audit.md</w:t>
+            </w:r>
+          </w:p>
+        </w:tc>
+      </w:tr>
+      <w:tr>
+        <w:tc>
+          <w:tcPr>
+            <w:tcW w:type="dxa" w:w="3118"/>
+          </w:tcPr>
+          <w:p>
+            <w:pPr>
+              <w:jc w:val="left"/>
+            </w:pPr>
+            <w:r>
+              <w:rPr>
+                <w:rFonts w:ascii="Times New Roman" w:hAnsi="Times New Roman"/>
+                <w:sz w:val="14"/>
+              </w:rPr>
+              <w:t>Rerata lima seed F1 temporal A2/LightGBM (seluruh 168.035 baris uji)</w:t>
+            </w:r>
+          </w:p>
+        </w:tc>
+        <w:tc>
+          <w:tcPr>
+            <w:tcW w:type="dxa" w:w="3118"/>
+          </w:tcPr>
+          <w:p>
+            <w:pPr>
+              <w:jc w:val="left"/>
+            </w:pPr>
+            <w:r>
+              <w:rPr>
+                <w:rFonts w:ascii="Times New Roman" w:hAnsi="Times New Roman"/>
+                <w:sz w:val="14"/>
+              </w:rPr>
+              <w:t>0,800461</w:t>
+            </w:r>
+          </w:p>
+        </w:tc>
+        <w:tc>
+          <w:tcPr>
+            <w:tcW w:type="dxa" w:w="3118"/>
+          </w:tcPr>
+          <w:p>
+            <w:pPr>
+              <w:jc w:val="left"/>
+            </w:pPr>
+            <w:r>
+              <w:rPr>
+                <w:rFonts w:ascii="Times New Roman" w:hAnsi="Times New Roman"/>
+                <w:sz w:val="14"/>
+              </w:rPr>
+              <w:t>summary.csv (eksperimen 5), protokol temporal; simpangan baku 0,001184</w:t>
+            </w:r>
+          </w:p>
+        </w:tc>
+      </w:tr>
+      <w:tr>
+        <w:tc>
+          <w:tcPr>
+            <w:tcW w:type="dxa" w:w="3118"/>
+          </w:tcPr>
+          <w:p>
+            <w:pPr>
+              <w:jc w:val="left"/>
+            </w:pPr>
+            <w:r>
+              <w:rPr>
+                <w:rFonts w:ascii="Times New Roman" w:hAnsi="Times New Roman"/>
+                <w:sz w:val="14"/>
+              </w:rPr>
+              <w:t>Rerata lima seed F1 temporal A2/XGBoost (seluruh 168.035 baris uji)</w:t>
+            </w:r>
+          </w:p>
+        </w:tc>
+        <w:tc>
+          <w:tcPr>
+            <w:tcW w:type="dxa" w:w="3118"/>
+          </w:tcPr>
+          <w:p>
+            <w:pPr>
+              <w:jc w:val="left"/>
+            </w:pPr>
+            <w:r>
+              <w:rPr>
+                <w:rFonts w:ascii="Times New Roman" w:hAnsi="Times New Roman"/>
+                <w:sz w:val="14"/>
+              </w:rPr>
+              <w:t>0,799629</w:t>
+            </w:r>
+          </w:p>
+        </w:tc>
+        <w:tc>
+          <w:tcPr>
+            <w:tcW w:type="dxa" w:w="3118"/>
+          </w:tcPr>
+          <w:p>
+            <w:pPr>
+              <w:jc w:val="left"/>
+            </w:pPr>
+            <w:r>
+              <w:rPr>
+                <w:rFonts w:ascii="Times New Roman" w:hAnsi="Times New Roman"/>
+                <w:sz w:val="14"/>
+              </w:rPr>
+              <w:t>summary.csv (eksperimen 5), protokol temporal; simpangan baku 0 (prosedur histogram deterministik)</w:t>
+            </w:r>
+          </w:p>
+        </w:tc>
+      </w:tr>
+      <w:tr>
+        <w:tc>
+          <w:tcPr>
+            <w:tcW w:type="dxa" w:w="3118"/>
+          </w:tcPr>
+          <w:p>
+            <w:pPr>
+              <w:jc w:val="left"/>
+            </w:pPr>
+            <w:r>
+              <w:rPr>
+                <w:rFonts w:ascii="Times New Roman" w:hAnsi="Times New Roman"/>
+                <w:sz w:val="14"/>
+              </w:rPr>
+              <w:t>Aturan FPR validasi &lt;= 1 %: FPR uji, recall uji, ambang terpilih</w:t>
+            </w:r>
+          </w:p>
+        </w:tc>
+        <w:tc>
+          <w:tcPr>
+            <w:tcW w:type="dxa" w:w="3118"/>
+          </w:tcPr>
+          <w:p>
+            <w:pPr>
+              <w:jc w:val="left"/>
+            </w:pPr>
+            <w:r>
+              <w:rPr>
+                <w:rFonts w:ascii="Times New Roman" w:hAnsi="Times New Roman"/>
+                <w:sz w:val="14"/>
+              </w:rPr>
+              <w:t>1,1352 %; 0,5440; 0,884705</w:t>
+            </w:r>
+          </w:p>
+        </w:tc>
+        <w:tc>
+          <w:tcPr>
+            <w:tcW w:type="dxa" w:w="3118"/>
+          </w:tcPr>
+          <w:p>
+            <w:pPr>
+              <w:jc w:val="left"/>
+            </w:pPr>
+            <w:r>
+              <w:rPr>
+                <w:rFonts w:ascii="Times New Roman" w:hAnsi="Times New Roman"/>
+                <w:sz w:val="14"/>
+              </w:rPr>
+              <w:t>test_metrics_primary_seed.csv (eksperimen 7, seed 13)</w:t>
+            </w:r>
+          </w:p>
+        </w:tc>
+      </w:tr>
+      <w:tr>
+        <w:tc>
+          <w:tcPr>
+            <w:tcW w:type="dxa" w:w="3118"/>
+          </w:tcPr>
+          <w:p>
+            <w:pPr>
+              <w:jc w:val="left"/>
+            </w:pPr>
+            <w:r>
+              <w:rPr>
+                <w:rFonts w:ascii="Times New Roman" w:hAnsi="Times New Roman"/>
+                <w:sz w:val="14"/>
+              </w:rPr>
+              <w:t>Aturan ambang 0,5: FPR uji dan recall uji</w:t>
+            </w:r>
+          </w:p>
+        </w:tc>
+        <w:tc>
+          <w:tcPr>
+            <w:tcW w:type="dxa" w:w="3118"/>
+          </w:tcPr>
+          <w:p>
+            <w:pPr>
+              <w:jc w:val="left"/>
+            </w:pPr>
+            <w:r>
+              <w:rPr>
+                <w:rFonts w:ascii="Times New Roman" w:hAnsi="Times New Roman"/>
+                <w:sz w:val="14"/>
+              </w:rPr>
+              <w:t>7,6497 %; 0,7380</w:t>
+            </w:r>
+          </w:p>
+        </w:tc>
+        <w:tc>
+          <w:tcPr>
+            <w:tcW w:type="dxa" w:w="3118"/>
+          </w:tcPr>
+          <w:p>
+            <w:pPr>
+              <w:jc w:val="left"/>
+            </w:pPr>
+            <w:r>
+              <w:rPr>
+                <w:rFonts w:ascii="Times New Roman" w:hAnsi="Times New Roman"/>
+                <w:sz w:val="14"/>
+              </w:rPr>
+              <w:t>test_metrics_primary_seed.csv (eksperimen 7, seed 13)</w:t>
+            </w:r>
+          </w:p>
+        </w:tc>
+      </w:tr>
+      <w:tr>
+        <w:tc>
+          <w:tcPr>
+            <w:tcW w:type="dxa" w:w="3118"/>
+          </w:tcPr>
+          <w:p>
+            <w:pPr>
+              <w:jc w:val="left"/>
+            </w:pPr>
+            <w:r>
+              <w:rPr>
+                <w:rFonts w:ascii="Times New Roman" w:hAnsi="Times New Roman"/>
+                <w:sz w:val="14"/>
+              </w:rPr>
+              <w:t>FPR pada URL benign dengan panjang &lt;= 30 karakter</w:t>
+            </w:r>
+          </w:p>
+        </w:tc>
+        <w:tc>
+          <w:tcPr>
+            <w:tcW w:type="dxa" w:w="3118"/>
+          </w:tcPr>
+          <w:p>
+            <w:pPr>
+              <w:jc w:val="left"/>
+            </w:pPr>
+            <w:r>
+              <w:rPr>
+                <w:rFonts w:ascii="Times New Roman" w:hAnsi="Times New Roman"/>
+                <w:sz w:val="14"/>
+              </w:rPr>
+              <w:t>21,8 %</w:t>
+            </w:r>
+          </w:p>
+        </w:tc>
+        <w:tc>
+          <w:tcPr>
+            <w:tcW w:type="dxa" w:w="3118"/>
+          </w:tcPr>
+          <w:p>
+            <w:pPr>
+              <w:jc w:val="left"/>
+            </w:pPr>
+            <w:r>
+              <w:rPr>
+                <w:rFonts w:ascii="Times New Roman" w:hAnsi="Times New Roman"/>
+                <w:sz w:val="14"/>
+              </w:rPr>
+              <w:t>category_error_table.csv (eksperimen 8), kategori url_length_band &lt;=30</w:t>
             </w:r>
           </w:p>
         </w:tc>

</xml_diff>

<commit_message>
v1.9.0: glm report fixes (A1-A0 delta, platform FN breakdown CSV)
</commit_message>
<xml_diff>
--- a/01_MANUSCRIPT/BITS_Draft_Phishing_URL_Leakage_v10_P1_candidate.docx
+++ b/01_MANUSCRIPT/BITS_Draft_Phishing_URL_Leakage_v10_P1_candidate.docx
@@ -6651,7 +6651,7 @@
           <w:rFonts w:ascii="Times New Roman" w:hAnsi="Times New Roman" w:eastAsia="Times New Roman"/>
           <w:sz w:val="19"/>
         </w:rPr>
-        <w:t xml:space="preserve"> Selisih rerata A1−A0 lintas lima seed pada Tabel 4 untuk F1 adalah −0,000568, sedangkan selisih berpasangan model seed 42 pada Tabel 5 adalah −0,000980; keduanya sah untuk estimandnya masing-masing dan tidak saling menggantikan.</w:t>
+        <w:t xml:space="preserve"> Selisih rerata A1−A0 lintas lima seed pada Tabel 4 untuk F1 adalah −0,000567, sedangkan selisih berpasangan model seed 42 pada Tabel 5 adalah −0,000980; keduanya sah untuk estimandnya masing-masing dan tidak saling menggantikan.</w:t>
       </w:r>
     </w:p>
     <w:p>
@@ -11831,7 +11831,7 @@
                 <w:rFonts w:ascii="Times New Roman" w:hAnsi="Times New Roman"/>
                 <w:sz w:val="14"/>
               </w:rPr>
-              <w:t>category_error_table.csv (8.035); README.md eksperimen 8 (rincian pages.dev 7.341)</w:t>
+              <w:t>category_error_table.csv (8.035); platform_fn_breakdown.csv dan README.md eksperimen 8 (rincian pages.dev 7.341, dilaporkan sebagai angka prosa)</w:t>
             </w:r>
           </w:p>
         </w:tc>

</xml_diff>

<commit_message>
v1.9.1: Table 1 [24] benign class is not independent
</commit_message>
<xml_diff>
--- a/01_MANUSCRIPT/BITS_Draft_Phishing_URL_Leakage_v10_P1_candidate.docx
+++ b/01_MANUSCRIPT/BITS_Draft_Phishing_URL_Leakage_v10_P1_candidate.docx
@@ -1254,7 +1254,7 @@
                 <w:rFonts w:ascii="Times New Roman" w:hAnsi="Times New Roman" w:eastAsia="Times New Roman"/>
                 <w:sz w:val="14"/>
               </w:rPr>
-              <w:t>PhiUSIIL 235.370 URL tervalidasi; validasi eksternal memakai PhishTank dengan benign independen</w:t>
+              <w:t>PhiUSIIL 235.370 URL tervalidasi; validasi eksternal memakai 49.121 URL PhishTank, dengan kelas benign diambil dari split uji PhiUSIIL yang dipegang</w:t>
             </w:r>
           </w:p>
         </w:tc>
@@ -1274,7 +1274,7 @@
                 <w:rFonts w:ascii="Times New Roman" w:hAnsi="Times New Roman" w:eastAsia="Times New Roman"/>
                 <w:sz w:val="14"/>
               </w:rPr>
-              <w:t>Robustness adversarial, generalisasi leave-one-family-out, stabilitas penjelasan, dan evaluasi eksternal lintas sumber (Subbagian 4.6)</w:t>
+              <w:t>Robustness adversarial, generalisasi leave-one-family-out, stabilitas penjelasan, dan validasi eksternal yang hanya eksternal pada sisi phishing (Subbagian 4.6), karena kelas benign diambil dari PhiUSIIL</w:t>
             </w:r>
           </w:p>
         </w:tc>

</xml_diff>

<commit_message>
v1.9.2: round-3 prose fixes (extractor claim, causal wording, grammar)
</commit_message>
<xml_diff>
--- a/01_MANUSCRIPT/BITS_Draft_Phishing_URL_Leakage_v10_P1_candidate.docx
+++ b/01_MANUSCRIPT/BITS_Draft_Phishing_URL_Leakage_v10_P1_candidate.docx
@@ -3624,7 +3624,7 @@
           <w:rFonts w:ascii="Times New Roman" w:hAnsi="Times New Roman" w:eastAsia="Times New Roman"/>
           <w:sz w:val="19"/>
         </w:rPr>
-        <w:t>Pada pembagian acak seed 42, 26,63 % baris uji berbagi registrable domain dengan baris latih; proporsinya 59,17 % pada baris uji phishing dan 2,37 % pada baris uji legitim. Ini merupakan pola tumpang tindih yang teramati, bukan bukti pengenalan oleh model, kebocoran, bias optimistis, atau inflasi kinerja. Analisis ini tidak mengisolasi kontribusi kausal paparan domain dari fitur ber-AUC tinggi yang tetap tersedia di A0. Producer hulu dan ketergantungan label fitur A0/A1 tersimpan masih belum diketahui.</w:t>
+        <w:t>Pada pembagian acak dengan seed 42, 26,63 % baris uji berbagi registrable domain dengan baris latih; proporsinya 59,17 % pada baris uji phishing dan 2,37 % pada baris uji legitim. Ini merupakan pola tumpang tindih yang teramati, bukan bukti pengenalan oleh model, kebocoran, bias optimistis, atau inflasi kinerja. Analisis ini tidak mengisolasi kontribusi kausal paparan domain dari fitur ber-AUC tinggi yang tetap tersedia di A0. Producer hulu dan ketergantungan label fitur A0/A1 tersimpan masih belum diketahui.</w:t>
       </w:r>
     </w:p>
     <w:p>
@@ -6599,52 +6599,7 @@
           <w:rFonts w:ascii="Times New Roman" w:hAnsi="Times New Roman" w:eastAsia="Times New Roman"/>
           <w:sz w:val="19"/>
         </w:rPr>
-        <w:t xml:space="preserve">Perlu ditegaskan bahwa rancangan ini menguji </w:t>
-      </w:r>
-      <w:r>
-        <w:rPr>
-          <w:rFonts w:ascii="Times New Roman" w:hAnsi="Times New Roman" w:eastAsia="Times New Roman"/>
-          <w:b/>
-          <w:sz w:val="19"/>
-        </w:rPr>
-        <w:t>kelompok</w:t>
-      </w:r>
-      <w:r>
-        <w:rPr>
-          <w:rFonts w:ascii="Times New Roman" w:hAnsi="Times New Roman" w:eastAsia="Times New Roman"/>
-          <w:sz w:val="19"/>
-        </w:rPr>
-        <w:t xml:space="preserve"> fitur. Enam fitur dihapus bersamaan, sehingga tidak ada identifikasi fitur mana di dalam kelompok yang bertanggung jawab. Klaim yang sah adalah "kelompok fitur konten menyumbang sekitar 0,001 F1 pada protokol </w:t>
-      </w:r>
-      <w:r>
-        <w:rPr>
-          <w:rFonts w:ascii="Times New Roman" w:hAnsi="Times New Roman" w:eastAsia="Times New Roman"/>
-          <w:i/>
-          <w:sz w:val="19"/>
-        </w:rPr>
-        <w:t>site-disjoint</w:t>
-      </w:r>
-      <w:r>
-        <w:rPr>
-          <w:rFonts w:ascii="Times New Roman" w:hAnsi="Times New Roman" w:eastAsia="Times New Roman"/>
-          <w:sz w:val="19"/>
-        </w:rPr>
-        <w:t xml:space="preserve">", bukan "fitur X menyumbang sekian". Untuk mengidentifikasi kontribusi per fitur diperlukan desain </w:t>
-      </w:r>
-      <w:r>
-        <w:rPr>
-          <w:rFonts w:ascii="Times New Roman" w:hAnsi="Times New Roman" w:eastAsia="Times New Roman"/>
-          <w:i/>
-          <w:sz w:val="19"/>
-        </w:rPr>
-        <w:t>leave-one-feature-out</w:t>
-      </w:r>
-      <w:r>
-        <w:rPr>
-          <w:rFonts w:ascii="Times New Roman" w:hAnsi="Times New Roman" w:eastAsia="Times New Roman"/>
-          <w:sz w:val="19"/>
-        </w:rPr>
-        <w:t xml:space="preserve"> terpisah, yang tidak dijalankan di sini.</w:t>
+        <w:t>Perlu ditegaskan bahwa rancangan ini menguji kelompok fitur. Enam fitur dihapus bersamaan, sehingga tidak ada identifikasi fitur mana di dalam kelompok yang bertanggung jawab. Klaim yang sah adalah "A1 memiliki F1 sekitar 0,001 lebih rendah daripada A0 pada protokol site-disjoint"; rancangan ini tidak menetapkan kontribusi kausal tiap fitur maupun kelompok fitur. Untuk mengidentifikasi kontribusi per fitur diperlukan desain leave-one-feature-out terpisah, yang tidak dijalankan di sini.</w:t>
       </w:r>
       <w:r>
         <w:rPr>
@@ -8926,7 +8881,7 @@
           <w:rFonts w:ascii="Times New Roman" w:hAnsi="Times New Roman" w:eastAsia="Times New Roman"/>
           <w:sz w:val="19"/>
         </w:rPr>
-        <w:t xml:space="preserve">Temuan ini lebih kuat daripada selisih statis pada Bagian 3.6 karena ekstraktor dan himpunan fitur sama serta pipeline target benar-benar dibekukan. Namun eksperimen tetap tidak menjelaskan </w:t>
+        <w:t xml:space="preserve">Temuan ini lebih kuat daripada selisih statis pada Bagian 3.6 karena kontrak 18 fitur dan urutannya sama serta pipeline target benar-benar dibekukan; dua salinan ekstraktor dipakai pada eksperimen berbeda dan kesetaraan nilai keduanya tidak diverifikasi dalam artikel ini. Namun eksperimen tetap tidak menjelaskan </w:t>
       </w:r>
       <w:r>
         <w:rPr>
@@ -12443,7 +12398,7 @@
           <w:rFonts w:ascii="Times New Roman" w:hAnsi="Times New Roman" w:eastAsia="Times New Roman"/>
           <w:sz w:val="19"/>
         </w:rPr>
-        <w:t>Pemilihan ambang berbasis validasi dapat menekan FPR uji dari 7,65% menjadi 1,14%, tetapi recall turun dari 0,738 menjadi 0,544. Analisis galat deskriptif menemukan 37,1% dari seluruh FN pada kategori host platform dan FPR 21,8% pada URL benign sepanjang paling banyak 30 karakter. Ketidakpastian antar-klaster domain untuk proporsi FN platform belum terkuantifikasi secara reproduktif dan tidak digunakan untuk inferensi. Kategori kohort ini saling tumpang tindih dan tidak menetapkan kelayakan operasional, yang tidak dapat disimpulkan dari F1 saja.</w:t>
+        <w:t>Pemilihan ambang berbasis validasi dapat menekan FPR uji dari 7,65% menjadi 1,14%, tetapi recall turun dari 0,738 menjadi 0,544. Analisis galat deskriptif menemukan 37,1% dari seluruh FN pada kategori host platform dan FPR 21,8% pada URL benign dengan panjang paling banyak 30 karakter. Ketidakpastian antar-klaster domain untuk proporsi FN platform belum terkuantifikasi secara reproduktif dan tidak digunakan untuk inferensi. Kategori kohort ini saling tumpang tindih dan tidak menetapkan kelayakan operasional, yang tidak dapat disimpulkan dari F1 saja.</w:t>
       </w:r>
     </w:p>
     <w:p>

</xml_diff>

<commit_message>
v1.9.3: Table 1 precision and within-label definitions
</commit_message>
<xml_diff>
--- a/01_MANUSCRIPT/BITS_Draft_Phishing_URL_Leakage_v10_P1_candidate.docx
+++ b/01_MANUSCRIPT/BITS_Draft_Phishing_URL_Leakage_v10_P1_candidate.docx
@@ -914,7 +914,7 @@
                 <w:rFonts w:ascii="Times New Roman" w:hAnsi="Times New Roman" w:eastAsia="Times New Roman"/>
                 <w:sz w:val="14"/>
               </w:rPr>
-              <w:t>Klasifikasi URL pada venue BITS; evaluasi dalam-korpus</w:t>
+              <w:t>Klasifikasi phishing URL dan website pada venue BITS; evaluasi dalam-korpus</w:t>
             </w:r>
           </w:p>
         </w:tc>
@@ -1084,7 +1084,7 @@
                 <w:rFonts w:ascii="Times New Roman" w:hAnsi="Times New Roman" w:eastAsia="Times New Roman"/>
                 <w:sz w:val="14"/>
               </w:rPr>
-              <w:t>Malware Android dan Windows</w:t>
+              <w:t>Malware Android dan Windows [14]; Android saja pada [15]</w:t>
             </w:r>
           </w:p>
         </w:tc>
@@ -3288,7 +3288,7 @@
           <w:rFonts w:ascii="Times New Roman" w:hAnsi="Times New Roman" w:eastAsia="Times New Roman"/>
           <w:sz w:val="19"/>
         </w:rPr>
-        <w:t>Eksperimen ini menguji RQ4 dengan kontrak A2 yang sama—ekstraktor URL bersama dan skema terurut 18 kolom—pada sumber dan target. Kesamaan kontrak tidak membuktikan kesamaan nilai A2 dengan nilai sumber terhitung sebelumnya yang bernama serupa. Pipeline saat ini memetakan phishing sebagai kelas 1 dan menggunakan probabilitas kelas tersebut; hal ini tidak memvalidasi polaritas metrik E3 lama. Ekstraksi 18 fitur, urutan kolom, parameter model, dan label positif phishing=1 diambil dari artefak tersimpan; manifest keluaran eksperimen transfer dicocokkan untuk urutan fitur dan ambang 0,5. Model LightGBM dan XGBoost dilatih hanya pada fold pelatihan pembagian acak PhiUSIIL seed 42 dan dievaluasi pada fold uji sumber sebagai referensi dalam-domain. Model yang sama kemudian diterapkan pada 168.035 baris kohort uji temporal PhreshPhish tanpa fitting, kalibrasi, normalisasi, pemilihan fitur, atau penyetelan ambang menggunakan data target. Ambang tetap 0,5.</w:t>
+        <w:t>Eksperimen ini menguji RQ4 dengan kontrak A2 yang sama—ekstraktor URL bersama dan skema terurut 18 kolom—pada sumber dan target. Kesamaan kontrak tidak membuktikan kesamaan nilai A2 dengan nilai sumber terhitung sebelumnya yang bernama serupa. Pipeline saat ini memetakan phishing sebagai kelas 1 dan menggunakan probabilitas kelas tersebut; hal ini tidak memvalidasi polaritas metrik E3 lama. Ekstraksi 18 fitur, urutan kolom, parameter model, dan label positif phishing=1 diambil dari artefak tersimpan; manifest keluaran eksperimen transfer dicocokkan untuk urutan fitur dan ambang 0,5. Model LightGBM dan XGBoost dilatih hanya pada fold pelatihan pembagian acak PhiUSIIL seed 42 dan dievaluasi pada fold uji sumber sebagai referensi dalam-domain. Tiga istilah dipakai konsisten di seluruh naskah: dalam-korpus berarti evaluasi temporal latih-lalu-uji di dalam PhreshPhish; dalam-sumber berarti evaluasi pada blok uji korpus sumber di dalam eksperimen transfer; dan dalam-domain berarti evaluasi referensi pada PhiUSIIL. Model yang sama kemudian diterapkan pada 168.035 baris kohort uji temporal PhreshPhish tanpa fitting, kalibrasi, normalisasi, pemilihan fitur, atau penyetelan ambang menggunakan data target. Ambang tetap 0,5.</w:t>
       </w:r>
     </w:p>
     <w:p>

</xml_diff>

<commit_message>
v1.9.4: duplicate ablation paragraph removed; reproducibility and cross-ref wording fixed
</commit_message>
<xml_diff>
--- a/01_MANUSCRIPT/BITS_Draft_Phishing_URL_Leakage_v10_P1_candidate.docx
+++ b/01_MANUSCRIPT/BITS_Draft_Phishing_URL_Leakage_v10_P1_candidate.docx
@@ -1274,7 +1274,7 @@
                 <w:rFonts w:ascii="Times New Roman" w:hAnsi="Times New Roman" w:eastAsia="Times New Roman"/>
                 <w:sz w:val="14"/>
               </w:rPr>
-              <w:t>Robustness adversarial, generalisasi leave-one-family-out, stabilitas penjelasan, dan validasi eksternal yang hanya eksternal pada sisi phishing (Subbagian 4.6), karena kelas benign diambil dari PhiUSIIL</w:t>
+              <w:t>Robustness adversarial, generalisasi leave-one-family-out, stabilitas penjelasan, dan validasi eksternal yang hanya eksternal pada sisi phishing (Subbagian 4.6 pada [24]), karena kelas benign diambil dari PhiUSIIL</w:t>
             </w:r>
           </w:p>
         </w:tc>
@@ -1430,7 +1430,7 @@
           <w:rFonts w:ascii="Times New Roman" w:hAnsi="Times New Roman" w:eastAsia="Times New Roman"/>
           <w:sz w:val="19"/>
         </w:rPr>
-        <w:t xml:space="preserve">Pada domain phishing URL, laporan kinerja tinggi merupakan hal yang umum. Tinjauan sistematis atas 80 makalah mengelompokkan pendekatan deteksi situs phishing menjadi berbasis daftar, kemiripan visual, heuristik, pembelajaran mesin, dan pembelajaran mendalam [16]. Pendekatan hibrida berbasis fitur URL melaporkan kinerja deteksi yang sangat tinggi pada korpus masing-masing [17], pendekatan leksikal dengan reduksi fitur ditujukan untuk lingkungan waktu nyata [18], dan studi kasus pada URL login menunjukkan bahwa komposisi himpunan uji mengubah laju positif palsu secara material [19]. Model berbasis karakter pada URL mentah juga menunjukkan bahwa representasi URL-saja dapat mencapai kinerja tinggi tanpa fitur halaman [20]. Protokol evaluasi terbaru pada korpus PhiUSIIL melaporkan akurasi 0,9962 sampai 0,9984 pada himpunan uji domain-disjoint untuk empat keluarga model, dan protokol yang sama juga memuat evaluasi eksternal lintas sumber pada Subbagian 4.6; kinerjanya turun tajam ketika URL dimutasi secara realistis [24]. Pola semacam ini konsisten dengan saturasi benchmark yang bersifat deskriptif: ketika banyak model berbeda mencapai skor hampir identik pada satu korpus, daya pembeda pada konfigurasi yang dievaluasi tampak terbatas untuk pertanyaan pemilihan model, dan artikel ini tidak menetapkan penyebabnya.</w:t>
+        <w:t xml:space="preserve">Pada domain phishing URL, laporan kinerja tinggi merupakan hal yang umum. Tinjauan sistematis atas 80 makalah mengelompokkan pendekatan deteksi situs phishing menjadi berbasis daftar, kemiripan visual, heuristik, pembelajaran mesin, dan pembelajaran mendalam [16]. Pendekatan hibrida berbasis fitur URL melaporkan kinerja deteksi yang sangat tinggi pada korpus masing-masing [17], pendekatan leksikal dengan reduksi fitur ditujukan untuk lingkungan waktu nyata [18], dan studi kasus pada URL login menunjukkan bahwa komposisi himpunan uji mengubah laju positif palsu secara material [19]. Model berbasis karakter pada URL mentah juga menunjukkan bahwa representasi URL-saja dapat mencapai kinerja tinggi tanpa fitur halaman [20]. Protokol evaluasi terbaru pada korpus PhiUSIIL melaporkan akurasi 0,9962 sampai 0,9984 pada himpunan uji domain-disjoint untuk empat keluarga model, dan protokol yang sama juga memuat evaluasi eksternal lintas sumber pada Subbagian 4.6 artikel tersebut; kinerjanya turun tajam ketika URL dimutasi secara realistis [24]. Pola semacam ini konsisten dengan saturasi benchmark yang bersifat deskriptif: ketika banyak model berbeda mencapai skor hampir identik pada satu korpus, daya pembeda pada konfigurasi yang dievaluasi tampak terbatas untuk pertanyaan pemilihan model, dan artikel ini tidak menetapkan penyebabnya.</w:t>
       </w:r>
     </w:p>
     <w:p>
@@ -1703,7 +1703,7 @@
           <w:rFonts w:ascii="Times New Roman" w:hAnsi="Times New Roman" w:eastAsia="Times New Roman"/>
           <w:sz w:val="19"/>
         </w:rPr>
-        <w:t>4. Taksonomi galat yang dapat direproduksi dari prediksi tersimpan, disertai dukungan kategori, interval Wilson, contoh yang direduksi, dan batas interpretasi deskriptif.</w:t>
+        <w:t>4. Taksonomi galat deskriptif yang diturunkan dari prediksi tersimpan, disertai dukungan kategori, interval Wilson, contoh yang direduksi, dan batas interpretasi deskriptif.</w:t>
       </w:r>
     </w:p>
     <w:p>
@@ -12284,7 +12284,7 @@
           <w:rFonts w:ascii="Times New Roman" w:hAnsi="Times New Roman" w:eastAsia="Times New Roman"/>
           <w:sz w:val="19"/>
         </w:rPr>
-        <w:t>Ablasi kelompok fitur konten menunjukkan penurunan F1 terukur dengan interval bootstrap F1 berpasangan yang tidak memuat nol untuk LightGBM maupun XGBoost; besar efeknya sekitar seperseribu F1. Pada rata-rata partisi uji 44.213,6 baris, jumlah kesalahan A0→A1 meningkat dari 12,8 menjadi 32,2 pada LightGBM dan dari 10,4 menjadi 39,0 pada XGBoost. Perbandingan ini menunjukkan perbedaan antara keterdeteksian statistik dan besar efek. Skor A0 mendekati satu pada benchmark ini, tetapi kontras kelompok tersebut tidak mengidentifikasi mengapa benchmark tersaturasi. Konsekuensi deployment tidak dapat disimpulkan tanpa prevalensi, biaya kesalahan, dan pemilihan ambang yang relevan.</w:t>
+        <w:t>Kontras A1−A0 pada Subbagian 3.4 menunjukkan perbedaan terukur dengan besar efek sekitar seperseribu F1; hasil itu tidak mengidentifikasi mekanisme saturasi maupun konsekuensi deployment. Konsekuensi deployment tidak dapat disimpulkan tanpa prevalensi, biaya kesalahan, dan pemilihan ambang yang relevan.</w:t>
       </w:r>
     </w:p>
     <w:p>

</xml_diff>